<commit_message>
new change on reference
</commit_message>
<xml_diff>
--- a/CV_Johnson_Mugarra_Standard.docx
+++ b/CV_Johnson_Mugarra_Standard.docx
@@ -1671,94 +1671,7 @@
           <w:sz w:val="21"/>
           <w:szCs w:val="21"/>
         </w:rPr>
-        <w:t>Gloria Ayesiga</w:t>
-      </w:r>
-      <w:r>
-        <w:rPr>
-          <w:rFonts w:ascii="Times New Roman" w:hAnsi="Times New Roman" w:cs="Times New Roman"/>
-          <w:sz w:val="21"/>
-          <w:szCs w:val="21"/>
-        </w:rPr>
-        <w:t>,</w:t>
-      </w:r>
-      <w:r>
-        <w:rPr>
-          <w:rFonts w:ascii="Times New Roman" w:hAnsi="Times New Roman" w:cs="Times New Roman"/>
-          <w:sz w:val="21"/>
-          <w:szCs w:val="21"/>
-        </w:rPr>
-        <w:t xml:space="preserve"> Supervisor</w:t>
-      </w:r>
-      <w:r>
-        <w:rPr>
-          <w:rFonts w:ascii="Times New Roman" w:hAnsi="Times New Roman" w:cs="Times New Roman"/>
-          <w:sz w:val="21"/>
-          <w:szCs w:val="21"/>
-        </w:rPr>
-        <w:t xml:space="preserve"> at </w:t>
-      </w:r>
-      <w:r>
-        <w:rPr>
-          <w:rFonts w:ascii="Times New Roman" w:hAnsi="Times New Roman" w:cs="Times New Roman"/>
-          <w:sz w:val="21"/>
-          <w:szCs w:val="21"/>
-        </w:rPr>
-        <w:t>IPA</w:t>
-      </w:r>
-      <w:r>
-        <w:rPr>
-          <w:rFonts w:ascii="Times New Roman" w:hAnsi="Times New Roman" w:cs="Times New Roman"/>
-          <w:sz w:val="21"/>
-          <w:szCs w:val="21"/>
-        </w:rPr>
-        <w:t>,</w:t>
-      </w:r>
-      <w:r>
-        <w:rPr>
-          <w:rFonts w:ascii="Times New Roman" w:hAnsi="Times New Roman" w:cs="Times New Roman"/>
-          <w:sz w:val="21"/>
-          <w:szCs w:val="21"/>
-        </w:rPr>
-        <w:t xml:space="preserve"> gayesiga@gmail.com</w:t>
-      </w:r>
-      <w:r>
-        <w:rPr>
-          <w:rFonts w:ascii="Times New Roman" w:hAnsi="Times New Roman" w:cs="Times New Roman"/>
-          <w:sz w:val="21"/>
-          <w:szCs w:val="21"/>
-        </w:rPr>
-        <w:t>,</w:t>
-      </w:r>
-      <w:r>
-        <w:rPr>
-          <w:rFonts w:ascii="Times New Roman" w:hAnsi="Times New Roman" w:cs="Times New Roman"/>
-          <w:sz w:val="21"/>
-          <w:szCs w:val="21"/>
-        </w:rPr>
-        <w:t xml:space="preserve"> +256759252676</w:t>
-      </w:r>
-    </w:p>
-    <w:p>
-      <w:pPr>
-        <w:pStyle w:val="ListParagraph"/>
-        <w:numPr>
-          <w:ilvl w:val="0"/>
-          <w:numId w:val="13"/>
-        </w:numPr>
-        <w:spacing w:after="0" w:line="240" w:lineRule="auto"/>
-        <w:rPr>
-          <w:rFonts w:ascii="Times New Roman" w:hAnsi="Times New Roman" w:cs="Times New Roman"/>
-          <w:sz w:val="21"/>
-          <w:szCs w:val="21"/>
-        </w:rPr>
-      </w:pPr>
-      <w:r>
-        <w:rPr>
-          <w:rFonts w:ascii="Times New Roman" w:hAnsi="Times New Roman" w:cs="Times New Roman"/>
-          <w:sz w:val="21"/>
-          <w:szCs w:val="21"/>
-        </w:rPr>
-        <w:t>Ronald Kagiri, Supervisor at Bronkar, rkagiri@gmail.com, +256782665971</w:t>
+        <w:t>Available on request</w:t>
       </w:r>
     </w:p>
     <w:sectPr>

</xml_diff>

<commit_message>
new update on timeline
</commit_message>
<xml_diff>
--- a/CV_Johnson_Mugarra_Standard.docx
+++ b/CV_Johnson_Mugarra_Standard.docx
@@ -368,7 +368,70 @@
           <w:sz w:val="21"/>
           <w:szCs w:val="21"/>
         </w:rPr>
-        <w:t>Research and Data Consultant, July 2026 - January 2027</w:t>
+        <w:t xml:space="preserve">Research and Data Consultant, </w:t>
+      </w:r>
+      <w:r>
+        <w:rPr>
+          <w:rFonts w:ascii="Times New Roman" w:hAnsi="Times New Roman" w:cs="Times New Roman"/>
+          <w:b/>
+          <w:sz w:val="21"/>
+          <w:szCs w:val="21"/>
+        </w:rPr>
+        <w:t>November</w:t>
+      </w:r>
+      <w:r>
+        <w:rPr>
+          <w:rFonts w:ascii="Times New Roman" w:hAnsi="Times New Roman" w:cs="Times New Roman"/>
+          <w:b/>
+          <w:sz w:val="21"/>
+          <w:szCs w:val="21"/>
+        </w:rPr>
+        <w:t xml:space="preserve"> 202</w:t>
+      </w:r>
+      <w:r>
+        <w:rPr>
+          <w:rFonts w:ascii="Times New Roman" w:hAnsi="Times New Roman" w:cs="Times New Roman"/>
+          <w:b/>
+          <w:sz w:val="21"/>
+          <w:szCs w:val="21"/>
+        </w:rPr>
+        <w:t>5</w:t>
+      </w:r>
+      <w:r>
+        <w:rPr>
+          <w:rFonts w:ascii="Times New Roman" w:hAnsi="Times New Roman" w:cs="Times New Roman"/>
+          <w:b/>
+          <w:sz w:val="21"/>
+          <w:szCs w:val="21"/>
+        </w:rPr>
+        <w:t xml:space="preserve"> - </w:t>
+      </w:r>
+      <w:r>
+        <w:rPr>
+          <w:rFonts w:ascii="Times New Roman" w:hAnsi="Times New Roman" w:cs="Times New Roman"/>
+          <w:b/>
+          <w:sz w:val="21"/>
+          <w:szCs w:val="21"/>
+        </w:rPr>
+        <w:t>September</w:t>
+      </w:r>
+      <w:r>
+        <w:rPr>
+          <w:rFonts w:ascii="Times New Roman" w:hAnsi="Times New Roman" w:cs="Times New Roman"/>
+          <w:b/>
+          <w:sz w:val="21"/>
+          <w:szCs w:val="21"/>
+        </w:rPr>
+        <w:t xml:space="preserve"> 202</w:t>
+      </w:r>
+      <w:r>
+        <w:rPr>
+          <w:rFonts w:ascii="Times New Roman" w:hAnsi="Times New Roman" w:cs="Times New Roman"/>
+          <w:b/>
+          <w:sz w:val="21"/>
+          <w:szCs w:val="21"/>
+        </w:rPr>
+        <w:t>6</w:t>
       </w:r>
     </w:p>
     <w:p>

</xml_diff>

<commit_message>
Improvement in the CV
</commit_message>
<xml_diff>
--- a/CV_Johnson_Mugarra_Standard.docx
+++ b/CV_Johnson_Mugarra_Standard.docx
@@ -4,145 +4,184 @@
   <w:body>
     <w:p>
       <w:pPr>
-        <w:spacing w:after="0" w:line="240" w:lineRule="auto"/>
-        <w:jc w:val="center"/>
-        <w:rPr>
-          <w:rFonts w:ascii="Times New Roman" w:hAnsi="Times New Roman" w:cs="Times New Roman"/>
-          <w:sz w:val="21"/>
-          <w:szCs w:val="21"/>
+        <w:spacing w:after="0" w:line="360" w:lineRule="auto"/>
+        <w:jc w:val="both"/>
+        <w:rPr>
+          <w:rFonts w:ascii="Times New Roman" w:hAnsi="Times New Roman" w:cs="Times New Roman"/>
+          <w:sz w:val="36"/>
+          <w:szCs w:val="36"/>
         </w:rPr>
       </w:pPr>
       <w:r>
         <w:rPr>
           <w:rFonts w:ascii="Times New Roman" w:hAnsi="Times New Roman" w:cs="Times New Roman"/>
           <w:b/>
-          <w:sz w:val="21"/>
-          <w:szCs w:val="21"/>
+          <w:sz w:val="36"/>
+          <w:szCs w:val="36"/>
         </w:rPr>
         <w:t>JOHNSON MUGARRA</w:t>
       </w:r>
     </w:p>
     <w:p>
       <w:pPr>
-        <w:spacing w:after="0" w:line="240" w:lineRule="auto"/>
-        <w:jc w:val="center"/>
-        <w:rPr>
-          <w:rFonts w:ascii="Times New Roman" w:hAnsi="Times New Roman" w:cs="Times New Roman"/>
-          <w:sz w:val="21"/>
-          <w:szCs w:val="21"/>
+        <w:spacing w:after="0" w:line="360" w:lineRule="auto"/>
+        <w:jc w:val="both"/>
+        <w:rPr>
+          <w:rFonts w:ascii="Times New Roman" w:hAnsi="Times New Roman" w:cs="Times New Roman"/>
+          <w:sz w:val="28"/>
+          <w:szCs w:val="28"/>
         </w:rPr>
       </w:pPr>
       <w:r>
         <w:rPr>
           <w:rFonts w:ascii="Times New Roman" w:hAnsi="Times New Roman" w:cs="Times New Roman"/>
-          <w:sz w:val="21"/>
-          <w:szCs w:val="21"/>
+          <w:sz w:val="28"/>
+          <w:szCs w:val="28"/>
         </w:rPr>
         <w:t>Data Scientist and Research Consultant</w:t>
       </w:r>
     </w:p>
     <w:p>
       <w:pPr>
-        <w:spacing w:after="0" w:line="240" w:lineRule="auto"/>
-        <w:jc w:val="center"/>
-        <w:rPr>
-          <w:rFonts w:ascii="Times New Roman" w:hAnsi="Times New Roman" w:cs="Times New Roman"/>
-          <w:sz w:val="21"/>
-          <w:szCs w:val="21"/>
+        <w:spacing w:after="0" w:line="360" w:lineRule="auto"/>
+        <w:jc w:val="both"/>
+        <w:rPr>
+          <w:rFonts w:ascii="Times New Roman" w:hAnsi="Times New Roman" w:cs="Times New Roman"/>
+          <w:sz w:val="24"/>
+          <w:szCs w:val="24"/>
         </w:rPr>
       </w:pPr>
       <w:r>
         <w:rPr>
           <w:rFonts w:ascii="Times New Roman" w:hAnsi="Times New Roman" w:cs="Times New Roman"/>
-          <w:sz w:val="21"/>
-          <w:szCs w:val="21"/>
-        </w:rPr>
-        <w:t>Kampala, Uganda, +256 702 860 815, johnsonmugarra@yahoo.com, johnsonmugarra.com, github.com/mugarrajohnson</w:t>
+          <w:sz w:val="24"/>
+          <w:szCs w:val="24"/>
+        </w:rPr>
+        <w:t xml:space="preserve">Kampala, Uganda, +256 702 860 815, </w:t>
+      </w:r>
+      <w:hyperlink r:id="rId6" w:history="1">
+        <w:r>
+          <w:rPr>
+            <w:rStyle w:val="Hyperlink"/>
+            <w:rFonts w:ascii="Times New Roman" w:hAnsi="Times New Roman" w:cs="Times New Roman"/>
+            <w:sz w:val="24"/>
+            <w:szCs w:val="24"/>
+          </w:rPr>
+          <w:t>johnsonmugarra@yahoo.com</w:t>
+        </w:r>
+      </w:hyperlink>
+      <w:r>
+        <w:rPr>
+          <w:rFonts w:ascii="Times New Roman" w:hAnsi="Times New Roman" w:cs="Times New Roman"/>
+          <w:sz w:val="24"/>
+          <w:szCs w:val="24"/>
+        </w:rPr>
+        <w:t xml:space="preserve">, </w:t>
+      </w:r>
+      <w:r>
+        <w:rPr>
+          <w:rFonts w:ascii="Times New Roman" w:hAnsi="Times New Roman" w:cs="Times New Roman"/>
+          <w:sz w:val="24"/>
+          <w:szCs w:val="24"/>
+        </w:rPr>
+        <w:t>johnsonmugarr</w:t>
+      </w:r>
+      <w:r>
+        <w:rPr>
+          <w:rFonts w:ascii="Times New Roman" w:hAnsi="Times New Roman" w:cs="Times New Roman"/>
+          <w:sz w:val="24"/>
+          <w:szCs w:val="24"/>
+        </w:rPr>
+        <w:t>a.com</w:t>
+      </w:r>
+      <w:r>
+        <w:rPr>
+          <w:rFonts w:ascii="Times New Roman" w:hAnsi="Times New Roman" w:cs="Times New Roman"/>
+          <w:sz w:val="24"/>
+          <w:szCs w:val="24"/>
+        </w:rPr>
+        <w:t xml:space="preserve"> </w:t>
       </w:r>
     </w:p>
     <w:p>
       <w:pPr>
-        <w:spacing w:after="0" w:line="240" w:lineRule="auto"/>
-        <w:jc w:val="center"/>
-        <w:rPr>
-          <w:rFonts w:ascii="Times New Roman" w:hAnsi="Times New Roman" w:cs="Times New Roman"/>
-          <w:sz w:val="2"/>
-          <w:szCs w:val="2"/>
-        </w:rPr>
-      </w:pPr>
-      <w:r>
-        <w:rPr>
-          <w:sz w:val="8"/>
-        </w:rPr>
-      </w:r>
+        <w:spacing w:after="0" w:line="360" w:lineRule="auto"/>
+        <w:jc w:val="both"/>
+        <w:rPr>
+          <w:rFonts w:ascii="Times New Roman" w:hAnsi="Times New Roman" w:cs="Times New Roman"/>
+          <w:sz w:val="24"/>
+          <w:szCs w:val="24"/>
+        </w:rPr>
+      </w:pPr>
     </w:p>
     <w:p>
       <w:pPr>
-        <w:spacing w:after="0" w:line="240" w:lineRule="auto"/>
-        <w:rPr>
-          <w:rFonts w:ascii="Times New Roman" w:hAnsi="Times New Roman" w:cs="Times New Roman"/>
-          <w:sz w:val="21"/>
-          <w:szCs w:val="21"/>
+        <w:spacing w:after="0" w:line="360" w:lineRule="auto"/>
+        <w:jc w:val="both"/>
+        <w:rPr>
+          <w:rFonts w:ascii="Times New Roman" w:hAnsi="Times New Roman" w:cs="Times New Roman"/>
+          <w:b/>
+          <w:sz w:val="36"/>
+          <w:szCs w:val="36"/>
         </w:rPr>
       </w:pPr>
       <w:r>
         <w:rPr>
           <w:rFonts w:ascii="Times New Roman" w:hAnsi="Times New Roman" w:cs="Times New Roman"/>
           <w:b/>
-          <w:sz w:val="21"/>
-          <w:szCs w:val="21"/>
+          <w:sz w:val="36"/>
+          <w:szCs w:val="36"/>
         </w:rPr>
         <w:t>PROFESSIONAL SUMMARY</w:t>
       </w:r>
     </w:p>
     <w:p>
       <w:pPr>
-        <w:spacing w:after="0" w:line="240" w:lineRule="auto"/>
-        <w:rPr>
-          <w:rFonts w:ascii="Times New Roman" w:hAnsi="Times New Roman" w:cs="Times New Roman"/>
-          <w:sz w:val="21"/>
-          <w:szCs w:val="21"/>
+        <w:spacing w:after="0" w:line="360" w:lineRule="auto"/>
+        <w:jc w:val="both"/>
+        <w:rPr>
+          <w:rFonts w:ascii="Times New Roman" w:hAnsi="Times New Roman" w:cs="Times New Roman"/>
+          <w:sz w:val="24"/>
+          <w:szCs w:val="24"/>
         </w:rPr>
       </w:pPr>
       <w:r>
         <w:rPr>
           <w:rFonts w:ascii="Times New Roman" w:hAnsi="Times New Roman" w:cs="Times New Roman"/>
-          <w:sz w:val="21"/>
-          <w:szCs w:val="21"/>
+          <w:sz w:val="24"/>
+          <w:szCs w:val="24"/>
         </w:rPr>
         <w:t>Data scientist and research consultant with an M.Sc. in Data Science and six years working with field and operational data across East Africa. At Enimiro I design studies (child labor, living income, pollination) and build the pipelines, dashboards, and yield models behind them. At the Center for Research and Communication I coordinate proposals and lead the technical work on evaluations covering design, sampling, tools, data quality, analysis, and reporting. Earlier roles cover vanilla value-chain forecasting with Makerere University and MAAIF, process evaluation at IPA, and field research for USAID SITES.</w:t>
       </w:r>
     </w:p>
     <w:p>
       <w:pPr>
-        <w:spacing w:after="0" w:line="240" w:lineRule="auto"/>
-        <w:rPr>
-          <w:rFonts w:ascii="Times New Roman" w:hAnsi="Times New Roman" w:cs="Times New Roman"/>
-          <w:sz w:val="2"/>
-          <w:szCs w:val="2"/>
-        </w:rPr>
-      </w:pPr>
-      <w:r>
-        <w:rPr>
-          <w:sz w:val="8"/>
-        </w:rPr>
-      </w:r>
+        <w:spacing w:after="0" w:line="360" w:lineRule="auto"/>
+        <w:jc w:val="both"/>
+        <w:rPr>
+          <w:rFonts w:ascii="Times New Roman" w:hAnsi="Times New Roman" w:cs="Times New Roman"/>
+          <w:sz w:val="24"/>
+          <w:szCs w:val="24"/>
+        </w:rPr>
+      </w:pPr>
     </w:p>
     <w:p>
       <w:pPr>
-        <w:spacing w:after="0" w:line="240" w:lineRule="auto"/>
-        <w:rPr>
-          <w:rFonts w:ascii="Times New Roman" w:hAnsi="Times New Roman" w:cs="Times New Roman"/>
-          <w:sz w:val="21"/>
-          <w:szCs w:val="21"/>
+        <w:spacing w:after="0" w:line="360" w:lineRule="auto"/>
+        <w:jc w:val="both"/>
+        <w:rPr>
+          <w:rFonts w:ascii="Times New Roman" w:hAnsi="Times New Roman" w:cs="Times New Roman"/>
+          <w:b/>
+          <w:sz w:val="36"/>
+          <w:szCs w:val="36"/>
         </w:rPr>
       </w:pPr>
       <w:r>
         <w:rPr>
           <w:rFonts w:ascii="Times New Roman" w:hAnsi="Times New Roman" w:cs="Times New Roman"/>
           <w:b/>
-          <w:sz w:val="21"/>
-          <w:szCs w:val="21"/>
+          <w:sz w:val="36"/>
+          <w:szCs w:val="36"/>
         </w:rPr>
         <w:t>CORE SKILLS</w:t>
       </w:r>
@@ -154,18 +193,19 @@
           <w:ilvl w:val="0"/>
           <w:numId w:val="10"/>
         </w:numPr>
-        <w:spacing w:after="0" w:line="240" w:lineRule="auto"/>
-        <w:rPr>
-          <w:rFonts w:ascii="Times New Roman" w:hAnsi="Times New Roman" w:cs="Times New Roman"/>
-          <w:sz w:val="21"/>
-          <w:szCs w:val="21"/>
+        <w:spacing w:after="0" w:line="360" w:lineRule="auto"/>
+        <w:jc w:val="both"/>
+        <w:rPr>
+          <w:rFonts w:ascii="Times New Roman" w:hAnsi="Times New Roman" w:cs="Times New Roman"/>
+          <w:sz w:val="24"/>
+          <w:szCs w:val="24"/>
         </w:rPr>
       </w:pPr>
       <w:r>
         <w:rPr>
           <w:rFonts w:ascii="Times New Roman" w:hAnsi="Times New Roman" w:cs="Times New Roman"/>
-          <w:sz w:val="21"/>
-          <w:szCs w:val="21"/>
+          <w:sz w:val="24"/>
+          <w:szCs w:val="24"/>
         </w:rPr>
         <w:t>Statistical software: Stata, R, Python, SQL, SAS, SPSS, Excel</w:t>
       </w:r>
@@ -177,18 +217,19 @@
           <w:ilvl w:val="0"/>
           <w:numId w:val="10"/>
         </w:numPr>
-        <w:spacing w:after="0" w:line="240" w:lineRule="auto"/>
-        <w:rPr>
-          <w:rFonts w:ascii="Times New Roman" w:hAnsi="Times New Roman" w:cs="Times New Roman"/>
-          <w:sz w:val="21"/>
-          <w:szCs w:val="21"/>
+        <w:spacing w:after="0" w:line="360" w:lineRule="auto"/>
+        <w:jc w:val="both"/>
+        <w:rPr>
+          <w:rFonts w:ascii="Times New Roman" w:hAnsi="Times New Roman" w:cs="Times New Roman"/>
+          <w:sz w:val="24"/>
+          <w:szCs w:val="24"/>
         </w:rPr>
       </w:pPr>
       <w:r>
         <w:rPr>
           <w:rFonts w:ascii="Times New Roman" w:hAnsi="Times New Roman" w:cs="Times New Roman"/>
-          <w:sz w:val="21"/>
-          <w:szCs w:val="21"/>
+          <w:sz w:val="24"/>
+          <w:szCs w:val="24"/>
         </w:rPr>
         <w:t>Research and evaluation: survey design, piloting and translation, computer-assisted interviewing, key informant interviews, focus group discussions, transcription</w:t>
       </w:r>
@@ -200,18 +241,19 @@
           <w:ilvl w:val="0"/>
           <w:numId w:val="10"/>
         </w:numPr>
-        <w:spacing w:after="0" w:line="240" w:lineRule="auto"/>
-        <w:rPr>
-          <w:rFonts w:ascii="Times New Roman" w:hAnsi="Times New Roman" w:cs="Times New Roman"/>
-          <w:sz w:val="21"/>
-          <w:szCs w:val="21"/>
+        <w:spacing w:after="0" w:line="360" w:lineRule="auto"/>
+        <w:jc w:val="both"/>
+        <w:rPr>
+          <w:rFonts w:ascii="Times New Roman" w:hAnsi="Times New Roman" w:cs="Times New Roman"/>
+          <w:sz w:val="24"/>
+          <w:szCs w:val="24"/>
         </w:rPr>
       </w:pPr>
       <w:r>
         <w:rPr>
           <w:rFonts w:ascii="Times New Roman" w:hAnsi="Times New Roman" w:cs="Times New Roman"/>
-          <w:sz w:val="21"/>
-          <w:szCs w:val="21"/>
+          <w:sz w:val="24"/>
+          <w:szCs w:val="24"/>
         </w:rPr>
         <w:t>Data collection and quality: questionnaires, tablet-based collection, enumerator training and supervision, validation, backup and documentation</w:t>
       </w:r>
@@ -223,18 +265,19 @@
           <w:ilvl w:val="0"/>
           <w:numId w:val="10"/>
         </w:numPr>
-        <w:spacing w:after="0" w:line="240" w:lineRule="auto"/>
-        <w:rPr>
-          <w:rFonts w:ascii="Times New Roman" w:hAnsi="Times New Roman" w:cs="Times New Roman"/>
-          <w:sz w:val="21"/>
-          <w:szCs w:val="21"/>
+        <w:spacing w:after="0" w:line="360" w:lineRule="auto"/>
+        <w:jc w:val="both"/>
+        <w:rPr>
+          <w:rFonts w:ascii="Times New Roman" w:hAnsi="Times New Roman" w:cs="Times New Roman"/>
+          <w:sz w:val="24"/>
+          <w:szCs w:val="24"/>
         </w:rPr>
       </w:pPr>
       <w:r>
         <w:rPr>
           <w:rFonts w:ascii="Times New Roman" w:hAnsi="Times New Roman" w:cs="Times New Roman"/>
-          <w:sz w:val="21"/>
-          <w:szCs w:val="21"/>
+          <w:sz w:val="24"/>
+          <w:szCs w:val="24"/>
         </w:rPr>
         <w:t>Visualization and reporting: Power BI, Tableau, dashboards, reports for donors and management</w:t>
       </w:r>
@@ -246,18 +289,19 @@
           <w:ilvl w:val="0"/>
           <w:numId w:val="10"/>
         </w:numPr>
-        <w:spacing w:after="0" w:line="240" w:lineRule="auto"/>
-        <w:rPr>
-          <w:rFonts w:ascii="Times New Roman" w:hAnsi="Times New Roman" w:cs="Times New Roman"/>
-          <w:sz w:val="21"/>
-          <w:szCs w:val="21"/>
+        <w:spacing w:after="0" w:line="360" w:lineRule="auto"/>
+        <w:jc w:val="both"/>
+        <w:rPr>
+          <w:rFonts w:ascii="Times New Roman" w:hAnsi="Times New Roman" w:cs="Times New Roman"/>
+          <w:sz w:val="24"/>
+          <w:szCs w:val="24"/>
         </w:rPr>
       </w:pPr>
       <w:r>
         <w:rPr>
           <w:rFonts w:ascii="Times New Roman" w:hAnsi="Times New Roman" w:cs="Times New Roman"/>
-          <w:sz w:val="21"/>
-          <w:szCs w:val="21"/>
+          <w:sz w:val="24"/>
+          <w:szCs w:val="24"/>
         </w:rPr>
         <w:t>Data systems: SurveyCTO API, PostgreSQL, Google Sheets, ETL pipelines, GeoPandas</w:t>
       </w:r>
@@ -269,18 +313,19 @@
           <w:ilvl w:val="0"/>
           <w:numId w:val="10"/>
         </w:numPr>
-        <w:spacing w:after="0" w:line="240" w:lineRule="auto"/>
-        <w:rPr>
-          <w:rFonts w:ascii="Times New Roman" w:hAnsi="Times New Roman" w:cs="Times New Roman"/>
-          <w:sz w:val="21"/>
-          <w:szCs w:val="21"/>
+        <w:spacing w:after="0" w:line="360" w:lineRule="auto"/>
+        <w:jc w:val="both"/>
+        <w:rPr>
+          <w:rFonts w:ascii="Times New Roman" w:hAnsi="Times New Roman" w:cs="Times New Roman"/>
+          <w:sz w:val="24"/>
+          <w:szCs w:val="24"/>
         </w:rPr>
       </w:pPr>
       <w:r>
         <w:rPr>
           <w:rFonts w:ascii="Times New Roman" w:hAnsi="Times New Roman" w:cs="Times New Roman"/>
-          <w:sz w:val="21"/>
-          <w:szCs w:val="21"/>
+          <w:sz w:val="24"/>
+          <w:szCs w:val="24"/>
         </w:rPr>
         <w:t>Machine learning and AI: scikit-learn, time-series forecasting, neural networks and CNNs in TensorFlow and PyTorch, and daily use of AI tools for cleaning data, writing code, and drafting, with the output checked by hand</w:t>
       </w:r>
@@ -292,119 +337,119 @@
           <w:ilvl w:val="0"/>
           <w:numId w:val="10"/>
         </w:numPr>
-        <w:spacing w:after="0" w:line="240" w:lineRule="auto"/>
-        <w:rPr>
-          <w:rFonts w:ascii="Times New Roman" w:hAnsi="Times New Roman" w:cs="Times New Roman"/>
-          <w:sz w:val="21"/>
-          <w:szCs w:val="21"/>
+        <w:spacing w:after="0" w:line="360" w:lineRule="auto"/>
+        <w:jc w:val="both"/>
+        <w:rPr>
+          <w:rFonts w:ascii="Times New Roman" w:hAnsi="Times New Roman" w:cs="Times New Roman"/>
+          <w:sz w:val="24"/>
+          <w:szCs w:val="24"/>
         </w:rPr>
       </w:pPr>
       <w:r>
         <w:rPr>
           <w:rFonts w:ascii="Times New Roman" w:hAnsi="Times New Roman" w:cs="Times New Roman"/>
-          <w:sz w:val="21"/>
-          <w:szCs w:val="21"/>
+          <w:sz w:val="24"/>
+          <w:szCs w:val="24"/>
         </w:rPr>
         <w:t xml:space="preserve">Proposal </w:t>
       </w:r>
       <w:r>
         <w:rPr>
           <w:rFonts w:ascii="Times New Roman" w:hAnsi="Times New Roman" w:cs="Times New Roman"/>
-          <w:sz w:val="21"/>
-          <w:szCs w:val="21"/>
+          <w:sz w:val="24"/>
+          <w:szCs w:val="24"/>
         </w:rPr>
         <w:t>development</w:t>
       </w:r>
       <w:r>
         <w:rPr>
           <w:rFonts w:ascii="Times New Roman" w:hAnsi="Times New Roman" w:cs="Times New Roman"/>
-          <w:sz w:val="21"/>
-          <w:szCs w:val="21"/>
+          <w:sz w:val="24"/>
+          <w:szCs w:val="24"/>
         </w:rPr>
         <w:t xml:space="preserve">: </w:t>
       </w:r>
       <w:r>
         <w:rPr>
           <w:rFonts w:ascii="Times New Roman" w:hAnsi="Times New Roman" w:cs="Times New Roman"/>
-          <w:sz w:val="21"/>
-          <w:szCs w:val="21"/>
+          <w:sz w:val="24"/>
+          <w:szCs w:val="24"/>
         </w:rPr>
         <w:t xml:space="preserve">concept note, </w:t>
       </w:r>
       <w:r>
         <w:rPr>
           <w:rFonts w:ascii="Times New Roman" w:hAnsi="Times New Roman" w:cs="Times New Roman"/>
-          <w:sz w:val="21"/>
-          <w:szCs w:val="21"/>
+          <w:sz w:val="24"/>
+          <w:szCs w:val="24"/>
         </w:rPr>
         <w:t xml:space="preserve">strategy, </w:t>
       </w:r>
       <w:r>
         <w:rPr>
           <w:rFonts w:ascii="Times New Roman" w:hAnsi="Times New Roman" w:cs="Times New Roman"/>
-          <w:sz w:val="21"/>
-          <w:szCs w:val="21"/>
+          <w:sz w:val="24"/>
+          <w:szCs w:val="24"/>
         </w:rPr>
         <w:t xml:space="preserve">design, </w:t>
       </w:r>
       <w:r>
         <w:rPr>
           <w:rFonts w:ascii="Times New Roman" w:hAnsi="Times New Roman" w:cs="Times New Roman"/>
-          <w:sz w:val="21"/>
-          <w:szCs w:val="21"/>
+          <w:sz w:val="24"/>
+          <w:szCs w:val="24"/>
         </w:rPr>
         <w:t>methods and work plans, budgeting, quality assurance</w:t>
       </w:r>
     </w:p>
     <w:p>
       <w:pPr>
-        <w:spacing w:after="0" w:line="240" w:lineRule="auto"/>
-        <w:rPr>
-          <w:rFonts w:ascii="Times New Roman" w:hAnsi="Times New Roman" w:cs="Times New Roman"/>
-          <w:sz w:val="2"/>
-          <w:szCs w:val="2"/>
-        </w:rPr>
-      </w:pPr>
-      <w:r>
-        <w:rPr>
-          <w:sz w:val="8"/>
-        </w:rPr>
-      </w:r>
+        <w:spacing w:after="0" w:line="360" w:lineRule="auto"/>
+        <w:jc w:val="both"/>
+        <w:rPr>
+          <w:rFonts w:ascii="Times New Roman" w:hAnsi="Times New Roman" w:cs="Times New Roman"/>
+          <w:sz w:val="24"/>
+          <w:szCs w:val="24"/>
+        </w:rPr>
+      </w:pPr>
     </w:p>
     <w:p>
       <w:pPr>
-        <w:spacing w:after="0" w:line="240" w:lineRule="auto"/>
-        <w:rPr>
-          <w:rFonts w:ascii="Times New Roman" w:hAnsi="Times New Roman" w:cs="Times New Roman"/>
-          <w:sz w:val="21"/>
-          <w:szCs w:val="21"/>
+        <w:spacing w:after="0" w:line="360" w:lineRule="auto"/>
+        <w:jc w:val="both"/>
+        <w:rPr>
+          <w:rFonts w:ascii="Times New Roman" w:hAnsi="Times New Roman" w:cs="Times New Roman"/>
+          <w:b/>
+          <w:sz w:val="36"/>
+          <w:szCs w:val="36"/>
         </w:rPr>
       </w:pPr>
       <w:r>
         <w:rPr>
           <w:rFonts w:ascii="Times New Roman" w:hAnsi="Times New Roman" w:cs="Times New Roman"/>
           <w:b/>
-          <w:sz w:val="21"/>
-          <w:szCs w:val="21"/>
+          <w:sz w:val="36"/>
+          <w:szCs w:val="36"/>
         </w:rPr>
         <w:t>WORK EXPERIENCE</w:t>
       </w:r>
     </w:p>
     <w:p>
       <w:pPr>
-        <w:spacing w:after="0" w:line="240" w:lineRule="auto"/>
-        <w:rPr>
-          <w:rFonts w:ascii="Times New Roman" w:hAnsi="Times New Roman" w:cs="Times New Roman"/>
-          <w:sz w:val="21"/>
-          <w:szCs w:val="21"/>
+        <w:spacing w:after="0" w:line="360" w:lineRule="auto"/>
+        <w:jc w:val="both"/>
+        <w:rPr>
+          <w:rFonts w:ascii="Times New Roman" w:hAnsi="Times New Roman" w:cs="Times New Roman"/>
+          <w:sz w:val="32"/>
+          <w:szCs w:val="32"/>
         </w:rPr>
       </w:pPr>
       <w:r>
         <w:rPr>
           <w:rFonts w:ascii="Times New Roman" w:hAnsi="Times New Roman" w:cs="Times New Roman"/>
           <w:b/>
-          <w:sz w:val="21"/>
-          <w:szCs w:val="21"/>
+          <w:sz w:val="32"/>
+          <w:szCs w:val="32"/>
         </w:rPr>
         <w:t xml:space="preserve">Research and Data Consultant, </w:t>
       </w:r>
@@ -412,81 +457,27 @@
         <w:rPr>
           <w:rFonts w:ascii="Times New Roman" w:hAnsi="Times New Roman" w:cs="Times New Roman"/>
           <w:b/>
-          <w:sz w:val="21"/>
-          <w:szCs w:val="21"/>
-        </w:rPr>
-        <w:t>November</w:t>
-      </w:r>
-      <w:r>
-        <w:rPr>
-          <w:rFonts w:ascii="Times New Roman" w:hAnsi="Times New Roman" w:cs="Times New Roman"/>
-          <w:b/>
-          <w:sz w:val="21"/>
-          <w:szCs w:val="21"/>
-        </w:rPr>
-        <w:t xml:space="preserve"> 202</w:t>
-      </w:r>
-      <w:r>
-        <w:rPr>
-          <w:rFonts w:ascii="Times New Roman" w:hAnsi="Times New Roman" w:cs="Times New Roman"/>
-          <w:b/>
-          <w:sz w:val="21"/>
-          <w:szCs w:val="21"/>
-        </w:rPr>
-        <w:t>5</w:t>
-      </w:r>
-      <w:r>
-        <w:rPr>
-          <w:rFonts w:ascii="Times New Roman" w:hAnsi="Times New Roman" w:cs="Times New Roman"/>
-          <w:b/>
-          <w:sz w:val="21"/>
-          <w:szCs w:val="21"/>
-        </w:rPr>
-        <w:t xml:space="preserve"> - </w:t>
-      </w:r>
-      <w:r>
-        <w:rPr>
-          <w:rFonts w:ascii="Times New Roman" w:hAnsi="Times New Roman" w:cs="Times New Roman"/>
-          <w:b/>
-          <w:sz w:val="21"/>
-          <w:szCs w:val="21"/>
-        </w:rPr>
-        <w:t>September</w:t>
-      </w:r>
-      <w:r>
-        <w:rPr>
-          <w:rFonts w:ascii="Times New Roman" w:hAnsi="Times New Roman" w:cs="Times New Roman"/>
-          <w:b/>
-          <w:sz w:val="21"/>
-          <w:szCs w:val="21"/>
-        </w:rPr>
-        <w:t xml:space="preserve"> 202</w:t>
-      </w:r>
-      <w:r>
-        <w:rPr>
-          <w:rFonts w:ascii="Times New Roman" w:hAnsi="Times New Roman" w:cs="Times New Roman"/>
-          <w:b/>
-          <w:sz w:val="21"/>
-          <w:szCs w:val="21"/>
-        </w:rPr>
-        <w:t>6</w:t>
+          <w:sz w:val="32"/>
+          <w:szCs w:val="32"/>
+        </w:rPr>
+        <w:t>November 2025 - October 2026</w:t>
       </w:r>
     </w:p>
     <w:p>
       <w:pPr>
-        <w:spacing w:after="0" w:line="240" w:lineRule="auto"/>
-        <w:rPr>
-          <w:rFonts w:ascii="Times New Roman" w:hAnsi="Times New Roman" w:cs="Times New Roman"/>
-          <w:sz w:val="21"/>
-          <w:szCs w:val="21"/>
+        <w:spacing w:after="0" w:line="360" w:lineRule="auto"/>
+        <w:jc w:val="both"/>
+        <w:rPr>
+          <w:rFonts w:ascii="Times New Roman" w:hAnsi="Times New Roman" w:cs="Times New Roman"/>
+          <w:sz w:val="28"/>
+          <w:szCs w:val="28"/>
         </w:rPr>
       </w:pPr>
       <w:r>
         <w:rPr>
           <w:rFonts w:ascii="Times New Roman" w:hAnsi="Times New Roman" w:cs="Times New Roman"/>
-          <w:i/>
-          <w:sz w:val="21"/>
-          <w:szCs w:val="21"/>
+          <w:sz w:val="28"/>
+          <w:szCs w:val="28"/>
         </w:rPr>
         <w:t>Enimiro Products Uganda Ltd, Kayunga, Uganda</w:t>
       </w:r>
@@ -498,18 +489,19 @@
           <w:ilvl w:val="0"/>
           <w:numId w:val="10"/>
         </w:numPr>
-        <w:spacing w:after="0" w:line="240" w:lineRule="auto"/>
-        <w:rPr>
-          <w:rFonts w:ascii="Times New Roman" w:hAnsi="Times New Roman" w:cs="Times New Roman"/>
-          <w:sz w:val="21"/>
-          <w:szCs w:val="21"/>
+        <w:spacing w:after="0" w:line="360" w:lineRule="auto"/>
+        <w:jc w:val="both"/>
+        <w:rPr>
+          <w:rFonts w:ascii="Times New Roman" w:hAnsi="Times New Roman" w:cs="Times New Roman"/>
+          <w:sz w:val="24"/>
+          <w:szCs w:val="24"/>
         </w:rPr>
       </w:pPr>
       <w:r>
         <w:rPr>
           <w:rFonts w:ascii="Times New Roman" w:hAnsi="Times New Roman" w:cs="Times New Roman"/>
-          <w:sz w:val="21"/>
-          <w:szCs w:val="21"/>
+          <w:sz w:val="24"/>
+          <w:szCs w:val="24"/>
         </w:rPr>
         <w:t>Coordinated the data team on collection, cleaning, and organization of operational data across farmer activities, crop production, sales, and sustainability.</w:t>
       </w:r>
@@ -521,19 +513,21 @@
           <w:ilvl w:val="0"/>
           <w:numId w:val="10"/>
         </w:numPr>
-        <w:spacing w:after="0" w:line="240" w:lineRule="auto"/>
-        <w:rPr>
-          <w:rFonts w:ascii="Times New Roman" w:hAnsi="Times New Roman" w:cs="Times New Roman"/>
-          <w:sz w:val="21"/>
-          <w:szCs w:val="21"/>
+        <w:spacing w:after="0" w:line="360" w:lineRule="auto"/>
+        <w:jc w:val="both"/>
+        <w:rPr>
+          <w:rFonts w:ascii="Times New Roman" w:hAnsi="Times New Roman" w:cs="Times New Roman"/>
+          <w:sz w:val="24"/>
+          <w:szCs w:val="24"/>
         </w:rPr>
       </w:pPr>
       <w:r>
         <w:rPr>
           <w:rFonts w:ascii="Times New Roman" w:hAnsi="Times New Roman" w:cs="Times New Roman"/>
-          <w:sz w:val="21"/>
-          <w:szCs w:val="21"/>
-        </w:rPr>
+          <w:sz w:val="24"/>
+          <w:szCs w:val="24"/>
+        </w:rPr>
+        <w:lastRenderedPageBreak/>
         <w:t>Maintained a Python pipeline moving SurveyCTO submissions into PostgreSQL raw, clean, and analysis tables, with scheduled exports to Google Sheets for dashboards.</w:t>
       </w:r>
     </w:p>
@@ -544,18 +538,19 @@
           <w:ilvl w:val="0"/>
           <w:numId w:val="10"/>
         </w:numPr>
-        <w:spacing w:after="0" w:line="240" w:lineRule="auto"/>
-        <w:rPr>
-          <w:rFonts w:ascii="Times New Roman" w:hAnsi="Times New Roman" w:cs="Times New Roman"/>
-          <w:sz w:val="21"/>
-          <w:szCs w:val="21"/>
+        <w:spacing w:after="0" w:line="360" w:lineRule="auto"/>
+        <w:jc w:val="both"/>
+        <w:rPr>
+          <w:rFonts w:ascii="Times New Roman" w:hAnsi="Times New Roman" w:cs="Times New Roman"/>
+          <w:sz w:val="24"/>
+          <w:szCs w:val="24"/>
         </w:rPr>
       </w:pPr>
       <w:r>
         <w:rPr>
           <w:rFonts w:ascii="Times New Roman" w:hAnsi="Times New Roman" w:cs="Times New Roman"/>
-          <w:sz w:val="21"/>
-          <w:szCs w:val="21"/>
+          <w:sz w:val="24"/>
+          <w:szCs w:val="24"/>
         </w:rPr>
         <w:t>Designed studies from proposal to analysis, including the child labor study, the living income study against Anker benchmarks, pollination and maturity modules, and the M&amp;E measurement plan.</w:t>
       </w:r>
@@ -567,18 +562,19 @@
           <w:ilvl w:val="0"/>
           <w:numId w:val="10"/>
         </w:numPr>
-        <w:spacing w:after="0" w:line="240" w:lineRule="auto"/>
-        <w:rPr>
-          <w:rFonts w:ascii="Times New Roman" w:hAnsi="Times New Roman" w:cs="Times New Roman"/>
-          <w:sz w:val="21"/>
-          <w:szCs w:val="21"/>
+        <w:spacing w:after="0" w:line="360" w:lineRule="auto"/>
+        <w:jc w:val="both"/>
+        <w:rPr>
+          <w:rFonts w:ascii="Times New Roman" w:hAnsi="Times New Roman" w:cs="Times New Roman"/>
+          <w:sz w:val="24"/>
+          <w:szCs w:val="24"/>
         </w:rPr>
       </w:pPr>
       <w:r>
         <w:rPr>
           <w:rFonts w:ascii="Times New Roman" w:hAnsi="Times New Roman" w:cs="Times New Roman"/>
-          <w:sz w:val="21"/>
-          <w:szCs w:val="21"/>
+          <w:sz w:val="24"/>
+          <w:szCs w:val="24"/>
         </w:rPr>
         <w:t>Matched GPS to district boundaries and maintained the farmer master with merge and change logs for audits.</w:t>
       </w:r>
@@ -590,18 +586,19 @@
           <w:ilvl w:val="0"/>
           <w:numId w:val="10"/>
         </w:numPr>
-        <w:spacing w:after="0" w:line="240" w:lineRule="auto"/>
-        <w:rPr>
-          <w:rFonts w:ascii="Times New Roman" w:hAnsi="Times New Roman" w:cs="Times New Roman"/>
-          <w:sz w:val="21"/>
-          <w:szCs w:val="21"/>
+        <w:spacing w:after="0" w:line="360" w:lineRule="auto"/>
+        <w:jc w:val="both"/>
+        <w:rPr>
+          <w:rFonts w:ascii="Times New Roman" w:hAnsi="Times New Roman" w:cs="Times New Roman"/>
+          <w:sz w:val="24"/>
+          <w:szCs w:val="24"/>
         </w:rPr>
       </w:pPr>
       <w:r>
         <w:rPr>
           <w:rFonts w:ascii="Times New Roman" w:hAnsi="Times New Roman" w:cs="Times New Roman"/>
-          <w:sz w:val="21"/>
-          <w:szCs w:val="21"/>
+          <w:sz w:val="24"/>
+          <w:szCs w:val="24"/>
         </w:rPr>
         <w:t>Built dashboards and reports tracking performance indicators for management and the board.</w:t>
       </w:r>
@@ -613,20 +610,39 @@
           <w:ilvl w:val="0"/>
           <w:numId w:val="10"/>
         </w:numPr>
-        <w:spacing w:after="0" w:line="240" w:lineRule="auto"/>
-        <w:rPr>
-          <w:rFonts w:ascii="Times New Roman" w:hAnsi="Times New Roman" w:cs="Times New Roman"/>
-          <w:sz w:val="21"/>
-          <w:szCs w:val="21"/>
+        <w:spacing w:after="0" w:line="360" w:lineRule="auto"/>
+        <w:jc w:val="both"/>
+        <w:rPr>
+          <w:rFonts w:ascii="Times New Roman" w:hAnsi="Times New Roman" w:cs="Times New Roman"/>
+          <w:sz w:val="24"/>
+          <w:szCs w:val="24"/>
         </w:rPr>
       </w:pPr>
       <w:r>
         <w:rPr>
           <w:rFonts w:ascii="Times New Roman" w:hAnsi="Times New Roman" w:cs="Times New Roman"/>
-          <w:sz w:val="21"/>
-          <w:szCs w:val="21"/>
-        </w:rPr>
-        <w:t>Ran statistical and trend checks to flag problems, and turned findings into training manuals and field guidance for staff.</w:t>
+          <w:sz w:val="24"/>
+          <w:szCs w:val="24"/>
+        </w:rPr>
+        <w:t xml:space="preserve">Ran statistical and trend checks to flag </w:t>
+      </w:r>
+      <w:proofErr w:type="gramStart"/>
+      <w:r>
+        <w:rPr>
+          <w:rFonts w:ascii="Times New Roman" w:hAnsi="Times New Roman" w:cs="Times New Roman"/>
+          <w:sz w:val="24"/>
+          <w:szCs w:val="24"/>
+        </w:rPr>
+        <w:t>problems, and</w:t>
+      </w:r>
+      <w:proofErr w:type="gramEnd"/>
+      <w:r>
+        <w:rPr>
+          <w:rFonts w:ascii="Times New Roman" w:hAnsi="Times New Roman" w:cs="Times New Roman"/>
+          <w:sz w:val="24"/>
+          <w:szCs w:val="24"/>
+        </w:rPr>
+        <w:t xml:space="preserve"> turned findings into training manuals and field guidance for staff.</w:t>
       </w:r>
     </w:p>
     <w:p>
@@ -636,20 +652,39 @@
           <w:ilvl w:val="0"/>
           <w:numId w:val="10"/>
         </w:numPr>
-        <w:spacing w:after="0" w:line="240" w:lineRule="auto"/>
-        <w:rPr>
-          <w:rFonts w:ascii="Times New Roman" w:hAnsi="Times New Roman" w:cs="Times New Roman"/>
-          <w:sz w:val="21"/>
-          <w:szCs w:val="21"/>
+        <w:spacing w:after="0" w:line="360" w:lineRule="auto"/>
+        <w:jc w:val="both"/>
+        <w:rPr>
+          <w:rFonts w:ascii="Times New Roman" w:hAnsi="Times New Roman" w:cs="Times New Roman"/>
+          <w:sz w:val="24"/>
+          <w:szCs w:val="24"/>
         </w:rPr>
       </w:pPr>
       <w:r>
         <w:rPr>
           <w:rFonts w:ascii="Times New Roman" w:hAnsi="Times New Roman" w:cs="Times New Roman"/>
-          <w:sz w:val="21"/>
-          <w:szCs w:val="21"/>
-        </w:rPr>
-        <w:t>Directed the data and M&amp;E workstream: built the M&amp;E measurement plan and monitoring toolkit (KPI dashboards, tier trackers, review packs) used across 19 district playbooks, and managed the field-extension restructuring from concept note to roll-out.</w:t>
+          <w:sz w:val="24"/>
+          <w:szCs w:val="24"/>
+        </w:rPr>
+        <w:t xml:space="preserve">Directed the data and M&amp;E workstream: built the M&amp;E measurement plan and monitoring toolkit (KPI dashboards, tier trackers, review packs) used across 19 district </w:t>
+      </w:r>
+      <w:proofErr w:type="gramStart"/>
+      <w:r>
+        <w:rPr>
+          <w:rFonts w:ascii="Times New Roman" w:hAnsi="Times New Roman" w:cs="Times New Roman"/>
+          <w:sz w:val="24"/>
+          <w:szCs w:val="24"/>
+        </w:rPr>
+        <w:t>playbooks, and</w:t>
+      </w:r>
+      <w:proofErr w:type="gramEnd"/>
+      <w:r>
+        <w:rPr>
+          <w:rFonts w:ascii="Times New Roman" w:hAnsi="Times New Roman" w:cs="Times New Roman"/>
+          <w:sz w:val="24"/>
+          <w:szCs w:val="24"/>
+        </w:rPr>
+        <w:t xml:space="preserve"> managed the field-extension restructuring from concept note to roll-out.</w:t>
       </w:r>
     </w:p>
     <w:p>
@@ -659,72 +694,59 @@
           <w:ilvl w:val="0"/>
           <w:numId w:val="10"/>
         </w:numPr>
-        <w:spacing w:after="0" w:line="240" w:lineRule="auto"/>
-        <w:rPr>
-          <w:rFonts w:ascii="Times New Roman" w:hAnsi="Times New Roman" w:cs="Times New Roman"/>
-          <w:sz w:val="21"/>
-          <w:szCs w:val="21"/>
+        <w:spacing w:after="0" w:line="360" w:lineRule="auto"/>
+        <w:jc w:val="both"/>
+        <w:rPr>
+          <w:rFonts w:ascii="Times New Roman" w:hAnsi="Times New Roman" w:cs="Times New Roman"/>
+          <w:sz w:val="24"/>
+          <w:szCs w:val="24"/>
         </w:rPr>
       </w:pPr>
       <w:r>
         <w:rPr>
           <w:rFonts w:ascii="Times New Roman" w:hAnsi="Times New Roman" w:cs="Times New Roman"/>
-          <w:sz w:val="21"/>
-          <w:szCs w:val="21"/>
+          <w:sz w:val="24"/>
+          <w:szCs w:val="24"/>
         </w:rPr>
         <w:t>Supported crop and supply-chain research, updated survey tools, trained staff on data use, and documented methods for donor and certification reporting.</w:t>
       </w:r>
     </w:p>
     <w:p>
       <w:pPr>
-        <w:spacing w:after="0" w:line="240" w:lineRule="auto"/>
+        <w:spacing w:after="0" w:line="360" w:lineRule="auto"/>
+        <w:jc w:val="both"/>
         <w:rPr>
           <w:rFonts w:ascii="Times New Roman" w:hAnsi="Times New Roman" w:cs="Times New Roman"/>
           <w:b/>
-          <w:sz w:val="2"/>
-          <w:szCs w:val="2"/>
+          <w:sz w:val="32"/>
+          <w:szCs w:val="32"/>
         </w:rPr>
       </w:pPr>
       <w:r>
         <w:rPr>
-          <w:sz w:val="8"/>
-        </w:rPr>
+          <w:rFonts w:ascii="Times New Roman" w:hAnsi="Times New Roman" w:cs="Times New Roman"/>
+          <w:b/>
+          <w:sz w:val="32"/>
+          <w:szCs w:val="32"/>
+        </w:rPr>
+        <w:t>Technical Lead Consultant, January 2025 - Present</w:t>
       </w:r>
     </w:p>
     <w:p>
       <w:pPr>
-        <w:spacing w:after="0" w:line="240" w:lineRule="auto"/>
-        <w:rPr>
-          <w:rFonts w:ascii="Times New Roman" w:hAnsi="Times New Roman" w:cs="Times New Roman"/>
-          <w:sz w:val="21"/>
-          <w:szCs w:val="21"/>
+        <w:spacing w:after="0" w:line="360" w:lineRule="auto"/>
+        <w:jc w:val="both"/>
+        <w:rPr>
+          <w:rFonts w:ascii="Times New Roman" w:hAnsi="Times New Roman" w:cs="Times New Roman"/>
+          <w:sz w:val="28"/>
+          <w:szCs w:val="28"/>
         </w:rPr>
       </w:pPr>
       <w:r>
         <w:rPr>
           <w:rFonts w:ascii="Times New Roman" w:hAnsi="Times New Roman" w:cs="Times New Roman"/>
-          <w:b/>
-          <w:sz w:val="21"/>
-          <w:szCs w:val="21"/>
-        </w:rPr>
-        <w:t>Technical Lead Consultant, January 2025 - June 2026</w:t>
-      </w:r>
-    </w:p>
-    <w:p>
-      <w:pPr>
-        <w:spacing w:after="0" w:line="240" w:lineRule="auto"/>
-        <w:rPr>
-          <w:rFonts w:ascii="Times New Roman" w:hAnsi="Times New Roman" w:cs="Times New Roman"/>
-          <w:sz w:val="21"/>
-          <w:szCs w:val="21"/>
-        </w:rPr>
-      </w:pPr>
-      <w:r>
-        <w:rPr>
-          <w:rFonts w:ascii="Times New Roman" w:hAnsi="Times New Roman" w:cs="Times New Roman"/>
-          <w:i/>
-          <w:sz w:val="21"/>
-          <w:szCs w:val="21"/>
+          <w:sz w:val="28"/>
+          <w:szCs w:val="28"/>
         </w:rPr>
         <w:t>Center for Research and Communication (CRC), Remote</w:t>
       </w:r>
@@ -736,20 +758,39 @@
           <w:ilvl w:val="0"/>
           <w:numId w:val="10"/>
         </w:numPr>
-        <w:spacing w:after="0" w:line="240" w:lineRule="auto"/>
-        <w:rPr>
-          <w:rFonts w:ascii="Times New Roman" w:hAnsi="Times New Roman" w:cs="Times New Roman"/>
-          <w:sz w:val="21"/>
-          <w:szCs w:val="21"/>
+        <w:spacing w:after="0" w:line="360" w:lineRule="auto"/>
+        <w:jc w:val="both"/>
+        <w:rPr>
+          <w:rFonts w:ascii="Times New Roman" w:hAnsi="Times New Roman" w:cs="Times New Roman"/>
+          <w:sz w:val="24"/>
+          <w:szCs w:val="24"/>
         </w:rPr>
       </w:pPr>
       <w:r>
         <w:rPr>
           <w:rFonts w:ascii="Times New Roman" w:hAnsi="Times New Roman" w:cs="Times New Roman"/>
-          <w:sz w:val="21"/>
-          <w:szCs w:val="21"/>
-        </w:rPr>
-        <w:t>Reviewed client requirements and evaluation criteria to set the proposal approach, and coordinated specialist inputs against deadlines.</w:t>
+          <w:sz w:val="24"/>
+          <w:szCs w:val="24"/>
+        </w:rPr>
+        <w:t xml:space="preserve">Reviewed client requirements and evaluation criteria to set the proposal </w:t>
+      </w:r>
+      <w:proofErr w:type="gramStart"/>
+      <w:r>
+        <w:rPr>
+          <w:rFonts w:ascii="Times New Roman" w:hAnsi="Times New Roman" w:cs="Times New Roman"/>
+          <w:sz w:val="24"/>
+          <w:szCs w:val="24"/>
+        </w:rPr>
+        <w:t>approach, and</w:t>
+      </w:r>
+      <w:proofErr w:type="gramEnd"/>
+      <w:r>
+        <w:rPr>
+          <w:rFonts w:ascii="Times New Roman" w:hAnsi="Times New Roman" w:cs="Times New Roman"/>
+          <w:sz w:val="24"/>
+          <w:szCs w:val="24"/>
+        </w:rPr>
+        <w:t xml:space="preserve"> coordinated specialist inputs against deadlines.</w:t>
       </w:r>
     </w:p>
     <w:p>
@@ -759,18 +800,19 @@
           <w:ilvl w:val="0"/>
           <w:numId w:val="10"/>
         </w:numPr>
-        <w:spacing w:after="0" w:line="240" w:lineRule="auto"/>
-        <w:rPr>
-          <w:rFonts w:ascii="Times New Roman" w:hAnsi="Times New Roman" w:cs="Times New Roman"/>
-          <w:sz w:val="21"/>
-          <w:szCs w:val="21"/>
+        <w:spacing w:after="0" w:line="360" w:lineRule="auto"/>
+        <w:jc w:val="both"/>
+        <w:rPr>
+          <w:rFonts w:ascii="Times New Roman" w:hAnsi="Times New Roman" w:cs="Times New Roman"/>
+          <w:sz w:val="24"/>
+          <w:szCs w:val="24"/>
         </w:rPr>
       </w:pPr>
       <w:r>
         <w:rPr>
           <w:rFonts w:ascii="Times New Roman" w:hAnsi="Times New Roman" w:cs="Times New Roman"/>
-          <w:sz w:val="21"/>
-          <w:szCs w:val="21"/>
+          <w:sz w:val="24"/>
+          <w:szCs w:val="24"/>
         </w:rPr>
         <w:t>Wrote and edited technical sections, including methods and work plans, and worked with finance to align technical approaches with compliant budgets.</w:t>
       </w:r>
@@ -782,18 +824,19 @@
           <w:ilvl w:val="0"/>
           <w:numId w:val="10"/>
         </w:numPr>
-        <w:spacing w:after="0" w:line="240" w:lineRule="auto"/>
-        <w:rPr>
-          <w:rFonts w:ascii="Times New Roman" w:hAnsi="Times New Roman" w:cs="Times New Roman"/>
-          <w:sz w:val="21"/>
-          <w:szCs w:val="21"/>
+        <w:spacing w:after="0" w:line="360" w:lineRule="auto"/>
+        <w:jc w:val="both"/>
+        <w:rPr>
+          <w:rFonts w:ascii="Times New Roman" w:hAnsi="Times New Roman" w:cs="Times New Roman"/>
+          <w:sz w:val="24"/>
+          <w:szCs w:val="24"/>
         </w:rPr>
       </w:pPr>
       <w:r>
         <w:rPr>
           <w:rFonts w:ascii="Times New Roman" w:hAnsi="Times New Roman" w:cs="Times New Roman"/>
-          <w:sz w:val="21"/>
-          <w:szCs w:val="21"/>
+          <w:sz w:val="24"/>
+          <w:szCs w:val="24"/>
         </w:rPr>
         <w:t>Led the technical work for the IRC MERP endline evaluation, covering design and tools, analysis and synthesis, and integration of qualitative and quantitative findings against the results framework.</w:t>
       </w:r>
@@ -805,18 +848,19 @@
           <w:ilvl w:val="0"/>
           <w:numId w:val="10"/>
         </w:numPr>
-        <w:spacing w:after="0" w:line="240" w:lineRule="auto"/>
-        <w:rPr>
-          <w:rFonts w:ascii="Times New Roman" w:hAnsi="Times New Roman" w:cs="Times New Roman"/>
-          <w:sz w:val="21"/>
-          <w:szCs w:val="21"/>
+        <w:spacing w:after="0" w:line="360" w:lineRule="auto"/>
+        <w:jc w:val="both"/>
+        <w:rPr>
+          <w:rFonts w:ascii="Times New Roman" w:hAnsi="Times New Roman" w:cs="Times New Roman"/>
+          <w:sz w:val="24"/>
+          <w:szCs w:val="24"/>
         </w:rPr>
       </w:pPr>
       <w:r>
         <w:rPr>
           <w:rFonts w:ascii="Times New Roman" w:hAnsi="Times New Roman" w:cs="Times New Roman"/>
-          <w:sz w:val="21"/>
-          <w:szCs w:val="21"/>
+          <w:sz w:val="24"/>
+          <w:szCs w:val="24"/>
         </w:rPr>
         <w:t>Led quantitative inputs for IRC baseline and perception studies: sampling, instrument testing, data-quality checks, and statistical analysis.</w:t>
       </w:r>
@@ -828,74 +872,93 @@
           <w:ilvl w:val="0"/>
           <w:numId w:val="10"/>
         </w:numPr>
-        <w:spacing w:after="0" w:line="240" w:lineRule="auto"/>
-        <w:rPr>
-          <w:rFonts w:ascii="Times New Roman" w:hAnsi="Times New Roman" w:cs="Times New Roman"/>
-          <w:sz w:val="21"/>
-          <w:szCs w:val="21"/>
+        <w:spacing w:after="0" w:line="360" w:lineRule="auto"/>
+        <w:jc w:val="both"/>
+        <w:rPr>
+          <w:rFonts w:ascii="Times New Roman" w:hAnsi="Times New Roman" w:cs="Times New Roman"/>
+          <w:sz w:val="24"/>
+          <w:szCs w:val="24"/>
         </w:rPr>
       </w:pPr>
       <w:r>
         <w:rPr>
           <w:rFonts w:ascii="Times New Roman" w:hAnsi="Times New Roman" w:cs="Times New Roman"/>
-          <w:sz w:val="21"/>
-          <w:szCs w:val="21"/>
+          <w:sz w:val="24"/>
+          <w:szCs w:val="24"/>
         </w:rPr>
         <w:t>Served as data and M&amp;E lead for UNICEF behavior change and awareness studies: tools, trackers, datasets, reach analysis, and report drafting.</w:t>
       </w:r>
     </w:p>
     <w:p>
       <w:pPr>
-        <w:spacing w:after="0" w:line="240" w:lineRule="auto"/>
+        <w:spacing w:after="0" w:line="360" w:lineRule="auto"/>
+        <w:jc w:val="both"/>
         <w:rPr>
           <w:rFonts w:ascii="Times New Roman" w:hAnsi="Times New Roman" w:cs="Times New Roman"/>
           <w:b/>
-          <w:sz w:val="2"/>
-          <w:szCs w:val="2"/>
+          <w:sz w:val="32"/>
+          <w:szCs w:val="32"/>
         </w:rPr>
       </w:pPr>
       <w:r>
         <w:rPr>
-          <w:sz w:val="8"/>
-        </w:rPr>
+          <w:rFonts w:ascii="Times New Roman" w:hAnsi="Times New Roman" w:cs="Times New Roman"/>
+          <w:b/>
+          <w:sz w:val="32"/>
+          <w:szCs w:val="32"/>
+        </w:rPr>
+        <w:t>Researcher / Data Scientist, Vanilla Value-Chain, January 2024 - June 2025</w:t>
       </w:r>
     </w:p>
     <w:p>
       <w:pPr>
-        <w:spacing w:after="0" w:line="240" w:lineRule="auto"/>
-        <w:rPr>
-          <w:rFonts w:ascii="Times New Roman" w:hAnsi="Times New Roman" w:cs="Times New Roman"/>
-          <w:sz w:val="21"/>
-          <w:szCs w:val="21"/>
+        <w:spacing w:after="0" w:line="360" w:lineRule="auto"/>
+        <w:jc w:val="both"/>
+        <w:rPr>
+          <w:rFonts w:ascii="Times New Roman" w:hAnsi="Times New Roman" w:cs="Times New Roman"/>
+          <w:sz w:val="28"/>
+          <w:szCs w:val="28"/>
         </w:rPr>
       </w:pPr>
       <w:r>
         <w:rPr>
           <w:rFonts w:ascii="Times New Roman" w:hAnsi="Times New Roman" w:cs="Times New Roman"/>
-          <w:b/>
-          <w:sz w:val="21"/>
-          <w:szCs w:val="21"/>
-        </w:rPr>
-        <w:t>Researcher / Data Scientist, Vanilla Value-Chain Research, January 2024 - June 2025</w:t>
+          <w:sz w:val="28"/>
+          <w:szCs w:val="28"/>
+        </w:rPr>
+        <w:t xml:space="preserve">Makerere University </w:t>
       </w:r>
-    </w:p>
-    <w:p>
-      <w:pPr>
-        <w:spacing w:after="0" w:line="240" w:lineRule="auto"/>
-        <w:rPr>
-          <w:rFonts w:ascii="Times New Roman" w:hAnsi="Times New Roman" w:cs="Times New Roman"/>
-          <w:sz w:val="21"/>
-          <w:szCs w:val="21"/>
-        </w:rPr>
-      </w:pPr>
       <w:r>
         <w:rPr>
           <w:rFonts w:ascii="Times New Roman" w:hAnsi="Times New Roman" w:cs="Times New Roman"/>
-          <w:i/>
-          <w:sz w:val="21"/>
-          <w:szCs w:val="21"/>
-        </w:rPr>
-        <w:t>Makerere University with MAAIF, Catholic Relief Services, and private sector partners, Uganda</w:t>
+          <w:sz w:val="28"/>
+          <w:szCs w:val="28"/>
+        </w:rPr>
+        <w:t>/</w:t>
+      </w:r>
+      <w:r>
+        <w:rPr>
+          <w:rFonts w:ascii="Times New Roman" w:hAnsi="Times New Roman" w:cs="Times New Roman"/>
+          <w:sz w:val="28"/>
+          <w:szCs w:val="28"/>
+        </w:rPr>
+        <w:t xml:space="preserve"> MAAIF, Catholic Relief Services, and </w:t>
+      </w:r>
+      <w:r>
+        <w:rPr>
+          <w:rFonts w:ascii="Times New Roman" w:hAnsi="Times New Roman" w:cs="Times New Roman"/>
+          <w:sz w:val="28"/>
+          <w:szCs w:val="28"/>
+        </w:rPr>
+        <w:t>sector</w:t>
+      </w:r>
+      <w:r>
+        <w:rPr>
+          <w:rFonts w:ascii="Times New Roman" w:hAnsi="Times New Roman" w:cs="Times New Roman"/>
+          <w:sz w:val="28"/>
+          <w:szCs w:val="28"/>
+        </w:rPr>
+        <w:t xml:space="preserve"> partners, Uganda</w:t>
       </w:r>
     </w:p>
     <w:p>
@@ -905,18 +968,19 @@
           <w:ilvl w:val="0"/>
           <w:numId w:val="10"/>
         </w:numPr>
-        <w:spacing w:after="0" w:line="240" w:lineRule="auto"/>
-        <w:rPr>
-          <w:rFonts w:ascii="Times New Roman" w:hAnsi="Times New Roman" w:cs="Times New Roman"/>
-          <w:sz w:val="21"/>
-          <w:szCs w:val="21"/>
+        <w:spacing w:after="0" w:line="360" w:lineRule="auto"/>
+        <w:jc w:val="both"/>
+        <w:rPr>
+          <w:rFonts w:ascii="Times New Roman" w:hAnsi="Times New Roman" w:cs="Times New Roman"/>
+          <w:sz w:val="24"/>
+          <w:szCs w:val="24"/>
         </w:rPr>
       </w:pPr>
       <w:r>
         <w:rPr>
           <w:rFonts w:ascii="Times New Roman" w:hAnsi="Times New Roman" w:cs="Times New Roman"/>
-          <w:sz w:val="21"/>
-          <w:szCs w:val="21"/>
+          <w:sz w:val="24"/>
+          <w:szCs w:val="24"/>
         </w:rPr>
         <w:t>Researched vanilla maturity and harvest timing for national harvest-declaration considerations, combining field and crop work with statistical modeling and thermal-time analysis.</w:t>
       </w:r>
@@ -928,18 +992,19 @@
           <w:ilvl w:val="0"/>
           <w:numId w:val="10"/>
         </w:numPr>
-        <w:spacing w:after="0" w:line="240" w:lineRule="auto"/>
-        <w:rPr>
-          <w:rFonts w:ascii="Times New Roman" w:hAnsi="Times New Roman" w:cs="Times New Roman"/>
-          <w:sz w:val="21"/>
-          <w:szCs w:val="21"/>
+        <w:spacing w:after="0" w:line="360" w:lineRule="auto"/>
+        <w:jc w:val="both"/>
+        <w:rPr>
+          <w:rFonts w:ascii="Times New Roman" w:hAnsi="Times New Roman" w:cs="Times New Roman"/>
+          <w:sz w:val="24"/>
+          <w:szCs w:val="24"/>
         </w:rPr>
       </w:pPr>
       <w:r>
         <w:rPr>
           <w:rFonts w:ascii="Times New Roman" w:hAnsi="Times New Roman" w:cs="Times New Roman"/>
-          <w:sz w:val="21"/>
-          <w:szCs w:val="21"/>
+          <w:sz w:val="24"/>
+          <w:szCs w:val="24"/>
         </w:rPr>
         <w:t>Integrated field, satellite climate, and survey data and built time-series models to compare maturity-assessment methods and their timing, quality, and price implications.</w:t>
       </w:r>
@@ -951,19 +1016,21 @@
           <w:ilvl w:val="0"/>
           <w:numId w:val="10"/>
         </w:numPr>
-        <w:spacing w:after="0" w:line="240" w:lineRule="auto"/>
-        <w:rPr>
-          <w:rFonts w:ascii="Times New Roman" w:hAnsi="Times New Roman" w:cs="Times New Roman"/>
-          <w:sz w:val="21"/>
-          <w:szCs w:val="21"/>
+        <w:spacing w:after="0" w:line="360" w:lineRule="auto"/>
+        <w:jc w:val="both"/>
+        <w:rPr>
+          <w:rFonts w:ascii="Times New Roman" w:hAnsi="Times New Roman" w:cs="Times New Roman"/>
+          <w:sz w:val="24"/>
+          <w:szCs w:val="24"/>
         </w:rPr>
       </w:pPr>
       <w:r>
         <w:rPr>
           <w:rFonts w:ascii="Times New Roman" w:hAnsi="Times New Roman" w:cs="Times New Roman"/>
-          <w:sz w:val="21"/>
-          <w:szCs w:val="21"/>
-        </w:rPr>
+          <w:sz w:val="24"/>
+          <w:szCs w:val="24"/>
+        </w:rPr>
+        <w:lastRenderedPageBreak/>
         <w:t>Conducted interviews with farmers and partners, field measurements, and seasonal maturity assessments across vanilla-growing districts.</w:t>
       </w:r>
     </w:p>
@@ -974,72 +1041,59 @@
           <w:ilvl w:val="0"/>
           <w:numId w:val="10"/>
         </w:numPr>
-        <w:spacing w:after="0" w:line="240" w:lineRule="auto"/>
-        <w:rPr>
-          <w:rFonts w:ascii="Times New Roman" w:hAnsi="Times New Roman" w:cs="Times New Roman"/>
-          <w:sz w:val="21"/>
-          <w:szCs w:val="21"/>
+        <w:spacing w:after="0" w:line="360" w:lineRule="auto"/>
+        <w:jc w:val="both"/>
+        <w:rPr>
+          <w:rFonts w:ascii="Times New Roman" w:hAnsi="Times New Roman" w:cs="Times New Roman"/>
+          <w:sz w:val="24"/>
+          <w:szCs w:val="24"/>
         </w:rPr>
       </w:pPr>
       <w:r>
         <w:rPr>
           <w:rFonts w:ascii="Times New Roman" w:hAnsi="Times New Roman" w:cs="Times New Roman"/>
-          <w:sz w:val="21"/>
-          <w:szCs w:val="21"/>
+          <w:sz w:val="24"/>
+          <w:szCs w:val="24"/>
         </w:rPr>
         <w:t>Helped establish the Kabanyolo demonstration plot and prepared models, scenario notes, and technical inputs for supervisors and project partners. Work concluded with program funding closure.</w:t>
       </w:r>
     </w:p>
     <w:p>
       <w:pPr>
-        <w:spacing w:after="0" w:line="240" w:lineRule="auto"/>
+        <w:spacing w:after="0" w:line="360" w:lineRule="auto"/>
+        <w:jc w:val="both"/>
         <w:rPr>
           <w:rFonts w:ascii="Times New Roman" w:hAnsi="Times New Roman" w:cs="Times New Roman"/>
           <w:b/>
-          <w:sz w:val="2"/>
-          <w:szCs w:val="2"/>
+          <w:sz w:val="32"/>
+          <w:szCs w:val="32"/>
         </w:rPr>
       </w:pPr>
       <w:r>
         <w:rPr>
-          <w:sz w:val="8"/>
-        </w:rPr>
-      </w:r>
-    </w:p>
-    <w:p>
-      <w:pPr>
-        <w:spacing w:after="0" w:line="240" w:lineRule="auto"/>
-        <w:rPr>
-          <w:rFonts w:ascii="Times New Roman" w:hAnsi="Times New Roman" w:cs="Times New Roman"/>
-          <w:sz w:val="21"/>
-          <w:szCs w:val="21"/>
-        </w:rPr>
-      </w:pPr>
-      <w:r>
-        <w:rPr>
           <w:rFonts w:ascii="Times New Roman" w:hAnsi="Times New Roman" w:cs="Times New Roman"/>
           <w:b/>
-          <w:sz w:val="21"/>
-          <w:szCs w:val="21"/>
+          <w:sz w:val="32"/>
+          <w:szCs w:val="32"/>
         </w:rPr>
         <w:t>Research Associate, February 2023 - November 2023</w:t>
       </w:r>
     </w:p>
     <w:p>
       <w:pPr>
-        <w:spacing w:after="0" w:line="240" w:lineRule="auto"/>
-        <w:rPr>
-          <w:rFonts w:ascii="Times New Roman" w:hAnsi="Times New Roman" w:cs="Times New Roman"/>
-          <w:sz w:val="21"/>
-          <w:szCs w:val="21"/>
+        <w:spacing w:after="0" w:line="360" w:lineRule="auto"/>
+        <w:jc w:val="both"/>
+        <w:rPr>
+          <w:rFonts w:ascii="Times New Roman" w:hAnsi="Times New Roman" w:cs="Times New Roman"/>
+          <w:sz w:val="28"/>
+          <w:szCs w:val="28"/>
         </w:rPr>
       </w:pPr>
       <w:r>
         <w:rPr>
           <w:rFonts w:ascii="Times New Roman" w:hAnsi="Times New Roman" w:cs="Times New Roman"/>
-          <w:i/>
-          <w:sz w:val="21"/>
-          <w:szCs w:val="21"/>
+          <w:sz w:val="28"/>
+          <w:szCs w:val="28"/>
         </w:rPr>
         <w:t>Innovations for Poverty Action (IPA), Kampala, Uganda</w:t>
       </w:r>
@@ -1051,18 +1105,19 @@
           <w:ilvl w:val="0"/>
           <w:numId w:val="10"/>
         </w:numPr>
-        <w:spacing w:after="0" w:line="240" w:lineRule="auto"/>
-        <w:rPr>
-          <w:rFonts w:ascii="Times New Roman" w:hAnsi="Times New Roman" w:cs="Times New Roman"/>
-          <w:sz w:val="21"/>
-          <w:szCs w:val="21"/>
+        <w:spacing w:after="0" w:line="360" w:lineRule="auto"/>
+        <w:jc w:val="both"/>
+        <w:rPr>
+          <w:rFonts w:ascii="Times New Roman" w:hAnsi="Times New Roman" w:cs="Times New Roman"/>
+          <w:sz w:val="24"/>
+          <w:szCs w:val="24"/>
         </w:rPr>
       </w:pPr>
       <w:r>
         <w:rPr>
           <w:rFonts w:ascii="Times New Roman" w:hAnsi="Times New Roman" w:cs="Times New Roman"/>
-          <w:sz w:val="21"/>
-          <w:szCs w:val="21"/>
+          <w:sz w:val="24"/>
+          <w:szCs w:val="24"/>
         </w:rPr>
         <w:t>Supported development and implementation of process evaluation plans with program managers.</w:t>
       </w:r>
@@ -1074,18 +1129,19 @@
           <w:ilvl w:val="0"/>
           <w:numId w:val="10"/>
         </w:numPr>
-        <w:spacing w:after="0" w:line="240" w:lineRule="auto"/>
-        <w:rPr>
-          <w:rFonts w:ascii="Times New Roman" w:hAnsi="Times New Roman" w:cs="Times New Roman"/>
-          <w:sz w:val="21"/>
-          <w:szCs w:val="21"/>
+        <w:spacing w:after="0" w:line="360" w:lineRule="auto"/>
+        <w:jc w:val="both"/>
+        <w:rPr>
+          <w:rFonts w:ascii="Times New Roman" w:hAnsi="Times New Roman" w:cs="Times New Roman"/>
+          <w:sz w:val="24"/>
+          <w:szCs w:val="24"/>
         </w:rPr>
       </w:pPr>
       <w:r>
         <w:rPr>
           <w:rFonts w:ascii="Times New Roman" w:hAnsi="Times New Roman" w:cs="Times New Roman"/>
-          <w:sz w:val="21"/>
-          <w:szCs w:val="21"/>
+          <w:sz w:val="24"/>
+          <w:szCs w:val="24"/>
         </w:rPr>
         <w:t>Designed survey instruments and supported piloting, translation, and computer-assisted interviewing.</w:t>
       </w:r>
@@ -1097,18 +1153,19 @@
           <w:ilvl w:val="0"/>
           <w:numId w:val="10"/>
         </w:numPr>
-        <w:spacing w:after="0" w:line="240" w:lineRule="auto"/>
-        <w:rPr>
-          <w:rFonts w:ascii="Times New Roman" w:hAnsi="Times New Roman" w:cs="Times New Roman"/>
-          <w:sz w:val="21"/>
-          <w:szCs w:val="21"/>
+        <w:spacing w:after="0" w:line="360" w:lineRule="auto"/>
+        <w:jc w:val="both"/>
+        <w:rPr>
+          <w:rFonts w:ascii="Times New Roman" w:hAnsi="Times New Roman" w:cs="Times New Roman"/>
+          <w:sz w:val="24"/>
+          <w:szCs w:val="24"/>
         </w:rPr>
       </w:pPr>
       <w:r>
         <w:rPr>
           <w:rFonts w:ascii="Times New Roman" w:hAnsi="Times New Roman" w:cs="Times New Roman"/>
-          <w:sz w:val="21"/>
-          <w:szCs w:val="21"/>
+          <w:sz w:val="24"/>
+          <w:szCs w:val="24"/>
         </w:rPr>
         <w:t>Coordinated evaluation logistics including timelines, field staffing, and procurement, and managed data entry, cleaning, and analysis.</w:t>
       </w:r>
@@ -1120,18 +1177,19 @@
           <w:ilvl w:val="0"/>
           <w:numId w:val="10"/>
         </w:numPr>
-        <w:spacing w:after="0" w:line="240" w:lineRule="auto"/>
-        <w:rPr>
-          <w:rFonts w:ascii="Times New Roman" w:hAnsi="Times New Roman" w:cs="Times New Roman"/>
-          <w:sz w:val="21"/>
-          <w:szCs w:val="21"/>
+        <w:spacing w:after="0" w:line="360" w:lineRule="auto"/>
+        <w:jc w:val="both"/>
+        <w:rPr>
+          <w:rFonts w:ascii="Times New Roman" w:hAnsi="Times New Roman" w:cs="Times New Roman"/>
+          <w:sz w:val="24"/>
+          <w:szCs w:val="24"/>
         </w:rPr>
       </w:pPr>
       <w:r>
         <w:rPr>
           <w:rFonts w:ascii="Times New Roman" w:hAnsi="Times New Roman" w:cs="Times New Roman"/>
-          <w:sz w:val="21"/>
-          <w:szCs w:val="21"/>
+          <w:sz w:val="24"/>
+          <w:szCs w:val="24"/>
         </w:rPr>
         <w:t>Applied data-quality protocols including enumerator audits and monitoring of data collection.</w:t>
       </w:r>
@@ -1143,74 +1201,61 @@
           <w:ilvl w:val="0"/>
           <w:numId w:val="10"/>
         </w:numPr>
-        <w:spacing w:after="0" w:line="240" w:lineRule="auto"/>
-        <w:rPr>
-          <w:rFonts w:ascii="Times New Roman" w:hAnsi="Times New Roman" w:cs="Times New Roman"/>
-          <w:sz w:val="21"/>
-          <w:szCs w:val="21"/>
+        <w:spacing w:after="0" w:line="360" w:lineRule="auto"/>
+        <w:jc w:val="both"/>
+        <w:rPr>
+          <w:rFonts w:ascii="Times New Roman" w:hAnsi="Times New Roman" w:cs="Times New Roman"/>
+          <w:sz w:val="24"/>
+          <w:szCs w:val="24"/>
         </w:rPr>
       </w:pPr>
       <w:r>
         <w:rPr>
           <w:rFonts w:ascii="Times New Roman" w:hAnsi="Times New Roman" w:cs="Times New Roman"/>
-          <w:sz w:val="21"/>
-          <w:szCs w:val="21"/>
+          <w:sz w:val="24"/>
+          <w:szCs w:val="24"/>
         </w:rPr>
         <w:t>Maintained relationships with partner organizations, contributed to meetings and reports, and supported research approvals and compliance.</w:t>
       </w:r>
     </w:p>
     <w:p>
       <w:pPr>
-        <w:spacing w:after="0" w:line="240" w:lineRule="auto"/>
+        <w:spacing w:after="0" w:line="360" w:lineRule="auto"/>
+        <w:jc w:val="both"/>
         <w:rPr>
           <w:rFonts w:ascii="Times New Roman" w:hAnsi="Times New Roman" w:cs="Times New Roman"/>
           <w:b/>
-          <w:sz w:val="2"/>
-          <w:szCs w:val="2"/>
+          <w:sz w:val="32"/>
+          <w:szCs w:val="32"/>
         </w:rPr>
       </w:pPr>
       <w:r>
         <w:rPr>
-          <w:sz w:val="8"/>
-        </w:rPr>
-      </w:r>
-    </w:p>
-    <w:p>
-      <w:pPr>
-        <w:spacing w:after="0" w:line="240" w:lineRule="auto"/>
-        <w:rPr>
-          <w:rFonts w:ascii="Times New Roman" w:hAnsi="Times New Roman" w:cs="Times New Roman"/>
-          <w:sz w:val="21"/>
-          <w:szCs w:val="21"/>
-        </w:rPr>
-      </w:pPr>
-      <w:r>
-        <w:rPr>
           <w:rFonts w:ascii="Times New Roman" w:hAnsi="Times New Roman" w:cs="Times New Roman"/>
           <w:b/>
-          <w:sz w:val="21"/>
-          <w:szCs w:val="21"/>
+          <w:sz w:val="32"/>
+          <w:szCs w:val="32"/>
         </w:rPr>
         <w:t>Qualitative Research Associate, July 2023 - March 2024</w:t>
       </w:r>
     </w:p>
     <w:p>
       <w:pPr>
-        <w:spacing w:after="0" w:line="240" w:lineRule="auto"/>
-        <w:rPr>
-          <w:rFonts w:ascii="Times New Roman" w:hAnsi="Times New Roman" w:cs="Times New Roman"/>
-          <w:sz w:val="21"/>
-          <w:szCs w:val="21"/>
+        <w:spacing w:after="0" w:line="360" w:lineRule="auto"/>
+        <w:jc w:val="both"/>
+        <w:rPr>
+          <w:rFonts w:ascii="Times New Roman" w:hAnsi="Times New Roman" w:cs="Times New Roman"/>
+          <w:sz w:val="28"/>
+          <w:szCs w:val="28"/>
         </w:rPr>
       </w:pPr>
       <w:r>
         <w:rPr>
           <w:rFonts w:ascii="Times New Roman" w:hAnsi="Times New Roman" w:cs="Times New Roman"/>
-          <w:i/>
-          <w:sz w:val="21"/>
-          <w:szCs w:val="21"/>
-        </w:rPr>
-        <w:t>Social and Scientific Systems for USAID Strategic Information Technical Support (SITES), Uganda</w:t>
+          <w:sz w:val="28"/>
+          <w:szCs w:val="28"/>
+        </w:rPr>
+        <w:t>USAID Strategic Information Technical Support (SITES), Uganda</w:t>
       </w:r>
     </w:p>
     <w:p>
@@ -1220,18 +1265,19 @@
           <w:ilvl w:val="0"/>
           <w:numId w:val="10"/>
         </w:numPr>
-        <w:spacing w:after="0" w:line="240" w:lineRule="auto"/>
-        <w:rPr>
-          <w:rFonts w:ascii="Times New Roman" w:hAnsi="Times New Roman" w:cs="Times New Roman"/>
-          <w:sz w:val="21"/>
-          <w:szCs w:val="21"/>
+        <w:spacing w:after="0" w:line="360" w:lineRule="auto"/>
+        <w:jc w:val="both"/>
+        <w:rPr>
+          <w:rFonts w:ascii="Times New Roman" w:hAnsi="Times New Roman" w:cs="Times New Roman"/>
+          <w:sz w:val="24"/>
+          <w:szCs w:val="24"/>
         </w:rPr>
       </w:pPr>
       <w:r>
         <w:rPr>
           <w:rFonts w:ascii="Times New Roman" w:hAnsi="Times New Roman" w:cs="Times New Roman"/>
-          <w:sz w:val="21"/>
-          <w:szCs w:val="21"/>
+          <w:sz w:val="24"/>
+          <w:szCs w:val="24"/>
         </w:rPr>
         <w:t>Trained on field methods and tools and managed questionnaires and tablets for fieldwork across Eastern and Northern Uganda.</w:t>
       </w:r>
@@ -1243,18 +1289,19 @@
           <w:ilvl w:val="0"/>
           <w:numId w:val="10"/>
         </w:numPr>
-        <w:spacing w:after="0" w:line="240" w:lineRule="auto"/>
-        <w:rPr>
-          <w:rFonts w:ascii="Times New Roman" w:hAnsi="Times New Roman" w:cs="Times New Roman"/>
-          <w:sz w:val="21"/>
-          <w:szCs w:val="21"/>
+        <w:spacing w:after="0" w:line="360" w:lineRule="auto"/>
+        <w:jc w:val="both"/>
+        <w:rPr>
+          <w:rFonts w:ascii="Times New Roman" w:hAnsi="Times New Roman" w:cs="Times New Roman"/>
+          <w:sz w:val="24"/>
+          <w:szCs w:val="24"/>
         </w:rPr>
       </w:pPr>
       <w:r>
         <w:rPr>
           <w:rFonts w:ascii="Times New Roman" w:hAnsi="Times New Roman" w:cs="Times New Roman"/>
-          <w:sz w:val="21"/>
-          <w:szCs w:val="21"/>
+          <w:sz w:val="24"/>
+          <w:szCs w:val="24"/>
         </w:rPr>
         <w:t>Assessed facility readiness for Health Information Exchange and paperless viral load requests, reviewing UgandaEMR records against ART registers.</w:t>
       </w:r>
@@ -1266,18 +1313,19 @@
           <w:ilvl w:val="0"/>
           <w:numId w:val="10"/>
         </w:numPr>
-        <w:spacing w:after="0" w:line="240" w:lineRule="auto"/>
-        <w:rPr>
-          <w:rFonts w:ascii="Times New Roman" w:hAnsi="Times New Roman" w:cs="Times New Roman"/>
-          <w:sz w:val="21"/>
-          <w:szCs w:val="21"/>
+        <w:spacing w:after="0" w:line="360" w:lineRule="auto"/>
+        <w:jc w:val="both"/>
+        <w:rPr>
+          <w:rFonts w:ascii="Times New Roman" w:hAnsi="Times New Roman" w:cs="Times New Roman"/>
+          <w:sz w:val="24"/>
+          <w:szCs w:val="24"/>
         </w:rPr>
       </w:pPr>
       <w:r>
         <w:rPr>
           <w:rFonts w:ascii="Times New Roman" w:hAnsi="Times New Roman" w:cs="Times New Roman"/>
-          <w:sz w:val="21"/>
-          <w:szCs w:val="21"/>
+          <w:sz w:val="24"/>
+          <w:szCs w:val="24"/>
         </w:rPr>
         <w:t>Conducted key informant interviews and FGDs with clinical and data staff and checked data quality across HMIS tools and the EMR.</w:t>
       </w:r>
@@ -1289,18 +1337,19 @@
           <w:ilvl w:val="0"/>
           <w:numId w:val="10"/>
         </w:numPr>
-        <w:spacing w:after="0" w:line="240" w:lineRule="auto"/>
-        <w:rPr>
-          <w:rFonts w:ascii="Times New Roman" w:hAnsi="Times New Roman" w:cs="Times New Roman"/>
-          <w:sz w:val="21"/>
-          <w:szCs w:val="21"/>
+        <w:spacing w:after="0" w:line="360" w:lineRule="auto"/>
+        <w:jc w:val="both"/>
+        <w:rPr>
+          <w:rFonts w:ascii="Times New Roman" w:hAnsi="Times New Roman" w:cs="Times New Roman"/>
+          <w:sz w:val="24"/>
+          <w:szCs w:val="24"/>
         </w:rPr>
       </w:pPr>
       <w:r>
         <w:rPr>
           <w:rFonts w:ascii="Times New Roman" w:hAnsi="Times New Roman" w:cs="Times New Roman"/>
-          <w:sz w:val="21"/>
-          <w:szCs w:val="21"/>
+          <w:sz w:val="24"/>
+          <w:szCs w:val="24"/>
         </w:rPr>
         <w:t>Documented constraints affecting EMR use, including DHIS2 knowledge, internet and power stability, and computer performance, and shared facility-level feedback at each visit.</w:t>
       </w:r>
@@ -1312,72 +1361,77 @@
           <w:ilvl w:val="0"/>
           <w:numId w:val="10"/>
         </w:numPr>
-        <w:spacing w:after="0" w:line="240" w:lineRule="auto"/>
-        <w:rPr>
-          <w:rFonts w:ascii="Times New Roman" w:hAnsi="Times New Roman" w:cs="Times New Roman"/>
-          <w:sz w:val="21"/>
-          <w:szCs w:val="21"/>
+        <w:spacing w:after="0" w:line="360" w:lineRule="auto"/>
+        <w:jc w:val="both"/>
+        <w:rPr>
+          <w:rFonts w:ascii="Times New Roman" w:hAnsi="Times New Roman" w:cs="Times New Roman"/>
+          <w:sz w:val="24"/>
+          <w:szCs w:val="24"/>
         </w:rPr>
       </w:pPr>
       <w:r>
         <w:rPr>
           <w:rFonts w:ascii="Times New Roman" w:hAnsi="Times New Roman" w:cs="Times New Roman"/>
-          <w:sz w:val="21"/>
-          <w:szCs w:val="21"/>
-        </w:rPr>
-        <w:t>Compiled progress and activity reports with safe backup and storage, completing a 12-day assessment in September 2023 within a seven-region exercise covering Kigezi, Ankole, Lango, Acholi, Busoga, Bugisu, and Karamoja.</w:t>
+          <w:sz w:val="24"/>
+          <w:szCs w:val="24"/>
+        </w:rPr>
+        <w:t xml:space="preserve">Compiled progress and activity reports with safe backup and storage, completing a 12-day assessment in September 2023 within a seven-region exercise covering Kigezi, Ankole, Lango, Acholi, Busoga, </w:t>
+      </w:r>
+      <w:proofErr w:type="spellStart"/>
+      <w:r>
+        <w:rPr>
+          <w:rFonts w:ascii="Times New Roman" w:hAnsi="Times New Roman" w:cs="Times New Roman"/>
+          <w:sz w:val="24"/>
+          <w:szCs w:val="24"/>
+        </w:rPr>
+        <w:t>Bugisu</w:t>
+      </w:r>
+      <w:proofErr w:type="spellEnd"/>
+      <w:r>
+        <w:rPr>
+          <w:rFonts w:ascii="Times New Roman" w:hAnsi="Times New Roman" w:cs="Times New Roman"/>
+          <w:sz w:val="24"/>
+          <w:szCs w:val="24"/>
+        </w:rPr>
+        <w:t>, and Karamoja.</w:t>
       </w:r>
     </w:p>
     <w:p>
       <w:pPr>
-        <w:spacing w:after="0" w:line="240" w:lineRule="auto"/>
+        <w:spacing w:after="0" w:line="360" w:lineRule="auto"/>
+        <w:jc w:val="both"/>
         <w:rPr>
           <w:rFonts w:ascii="Times New Roman" w:hAnsi="Times New Roman" w:cs="Times New Roman"/>
           <w:b/>
-          <w:sz w:val="2"/>
-          <w:szCs w:val="2"/>
+          <w:sz w:val="32"/>
+          <w:szCs w:val="32"/>
         </w:rPr>
       </w:pPr>
       <w:r>
         <w:rPr>
-          <w:sz w:val="8"/>
-        </w:rPr>
-      </w:r>
-    </w:p>
-    <w:p>
-      <w:pPr>
-        <w:spacing w:after="0" w:line="240" w:lineRule="auto"/>
-        <w:rPr>
-          <w:rFonts w:ascii="Times New Roman" w:hAnsi="Times New Roman" w:cs="Times New Roman"/>
-          <w:sz w:val="21"/>
-          <w:szCs w:val="21"/>
-        </w:rPr>
-      </w:pPr>
-      <w:r>
-        <w:rPr>
           <w:rFonts w:ascii="Times New Roman" w:hAnsi="Times New Roman" w:cs="Times New Roman"/>
           <w:b/>
-          <w:sz w:val="21"/>
-          <w:szCs w:val="21"/>
+          <w:sz w:val="32"/>
+          <w:szCs w:val="32"/>
         </w:rPr>
         <w:t>Research Associate, September 2021 - January 2023</w:t>
       </w:r>
     </w:p>
     <w:p>
       <w:pPr>
-        <w:spacing w:after="0" w:line="240" w:lineRule="auto"/>
-        <w:rPr>
-          <w:rFonts w:ascii="Times New Roman" w:hAnsi="Times New Roman" w:cs="Times New Roman"/>
-          <w:sz w:val="21"/>
-          <w:szCs w:val="21"/>
+        <w:spacing w:after="0" w:line="360" w:lineRule="auto"/>
+        <w:jc w:val="both"/>
+        <w:rPr>
+          <w:rFonts w:ascii="Times New Roman" w:hAnsi="Times New Roman" w:cs="Times New Roman"/>
+          <w:sz w:val="28"/>
+          <w:szCs w:val="28"/>
         </w:rPr>
       </w:pPr>
       <w:r>
         <w:rPr>
           <w:rFonts w:ascii="Times New Roman" w:hAnsi="Times New Roman" w:cs="Times New Roman"/>
-          <w:i/>
-          <w:sz w:val="21"/>
-          <w:szCs w:val="21"/>
+          <w:sz w:val="28"/>
+          <w:szCs w:val="28"/>
         </w:rPr>
         <w:t>Bronkar (U) Limited, Kampala, Uganda</w:t>
       </w:r>
@@ -1389,18 +1443,19 @@
           <w:ilvl w:val="0"/>
           <w:numId w:val="10"/>
         </w:numPr>
-        <w:spacing w:after="0" w:line="240" w:lineRule="auto"/>
-        <w:rPr>
-          <w:rFonts w:ascii="Times New Roman" w:hAnsi="Times New Roman" w:cs="Times New Roman"/>
-          <w:sz w:val="21"/>
-          <w:szCs w:val="21"/>
+        <w:spacing w:after="0" w:line="360" w:lineRule="auto"/>
+        <w:jc w:val="both"/>
+        <w:rPr>
+          <w:rFonts w:ascii="Times New Roman" w:hAnsi="Times New Roman" w:cs="Times New Roman"/>
+          <w:sz w:val="24"/>
+          <w:szCs w:val="24"/>
         </w:rPr>
       </w:pPr>
       <w:r>
         <w:rPr>
           <w:rFonts w:ascii="Times New Roman" w:hAnsi="Times New Roman" w:cs="Times New Roman"/>
-          <w:sz w:val="21"/>
-          <w:szCs w:val="21"/>
+          <w:sz w:val="24"/>
+          <w:szCs w:val="24"/>
         </w:rPr>
         <w:t>Developed assignment workplans and tracked deliverables across research assignments.</w:t>
       </w:r>
@@ -1412,18 +1467,19 @@
           <w:ilvl w:val="0"/>
           <w:numId w:val="10"/>
         </w:numPr>
-        <w:spacing w:after="0" w:line="240" w:lineRule="auto"/>
-        <w:rPr>
-          <w:rFonts w:ascii="Times New Roman" w:hAnsi="Times New Roman" w:cs="Times New Roman"/>
-          <w:sz w:val="21"/>
-          <w:szCs w:val="21"/>
+        <w:spacing w:after="0" w:line="360" w:lineRule="auto"/>
+        <w:jc w:val="both"/>
+        <w:rPr>
+          <w:rFonts w:ascii="Times New Roman" w:hAnsi="Times New Roman" w:cs="Times New Roman"/>
+          <w:sz w:val="24"/>
+          <w:szCs w:val="24"/>
         </w:rPr>
       </w:pPr>
       <w:r>
         <w:rPr>
           <w:rFonts w:ascii="Times New Roman" w:hAnsi="Times New Roman" w:cs="Times New Roman"/>
-          <w:sz w:val="21"/>
-          <w:szCs w:val="21"/>
+          <w:sz w:val="24"/>
+          <w:szCs w:val="24"/>
         </w:rPr>
         <w:t>Designed methods and survey tools for qualitative and quantitative collection.</w:t>
       </w:r>
@@ -1435,18 +1491,19 @@
           <w:ilvl w:val="0"/>
           <w:numId w:val="10"/>
         </w:numPr>
-        <w:spacing w:after="0" w:line="240" w:lineRule="auto"/>
-        <w:rPr>
-          <w:rFonts w:ascii="Times New Roman" w:hAnsi="Times New Roman" w:cs="Times New Roman"/>
-          <w:sz w:val="21"/>
-          <w:szCs w:val="21"/>
+        <w:spacing w:after="0" w:line="360" w:lineRule="auto"/>
+        <w:jc w:val="both"/>
+        <w:rPr>
+          <w:rFonts w:ascii="Times New Roman" w:hAnsi="Times New Roman" w:cs="Times New Roman"/>
+          <w:sz w:val="24"/>
+          <w:szCs w:val="24"/>
         </w:rPr>
       </w:pPr>
       <w:r>
         <w:rPr>
           <w:rFonts w:ascii="Times New Roman" w:hAnsi="Times New Roman" w:cs="Times New Roman"/>
-          <w:sz w:val="21"/>
-          <w:szCs w:val="21"/>
+          <w:sz w:val="24"/>
+          <w:szCs w:val="24"/>
         </w:rPr>
         <w:t>Trained enumerators and participated in field research including interviews and structured surveys.</w:t>
       </w:r>
@@ -1458,53 +1515,51 @@
           <w:ilvl w:val="0"/>
           <w:numId w:val="10"/>
         </w:numPr>
-        <w:spacing w:after="0" w:line="240" w:lineRule="auto"/>
-        <w:rPr>
-          <w:rFonts w:ascii="Times New Roman" w:hAnsi="Times New Roman" w:cs="Times New Roman"/>
-          <w:sz w:val="21"/>
-          <w:szCs w:val="21"/>
+        <w:spacing w:after="0" w:line="360" w:lineRule="auto"/>
+        <w:jc w:val="both"/>
+        <w:rPr>
+          <w:rFonts w:ascii="Times New Roman" w:hAnsi="Times New Roman" w:cs="Times New Roman"/>
+          <w:sz w:val="24"/>
+          <w:szCs w:val="24"/>
         </w:rPr>
       </w:pPr>
       <w:r>
         <w:rPr>
           <w:rFonts w:ascii="Times New Roman" w:hAnsi="Times New Roman" w:cs="Times New Roman"/>
-          <w:sz w:val="21"/>
-          <w:szCs w:val="21"/>
+          <w:sz w:val="24"/>
+          <w:szCs w:val="24"/>
         </w:rPr>
         <w:t>Cleaned and analyzed survey data and prepared findings for client reports and proposals.</w:t>
       </w:r>
     </w:p>
     <w:p>
       <w:pPr>
-        <w:spacing w:after="0" w:line="240" w:lineRule="auto"/>
-        <w:rPr>
-          <w:rFonts w:ascii="Times New Roman" w:hAnsi="Times New Roman" w:cs="Times New Roman"/>
-          <w:b/>
-          <w:sz w:val="2"/>
-          <w:szCs w:val="2"/>
-        </w:rPr>
-      </w:pPr>
-      <w:r>
-        <w:rPr>
-          <w:sz w:val="8"/>
-        </w:rPr>
-      </w:r>
+        <w:spacing w:after="0" w:line="360" w:lineRule="auto"/>
+        <w:jc w:val="both"/>
+        <w:rPr>
+          <w:rFonts w:ascii="Times New Roman" w:hAnsi="Times New Roman" w:cs="Times New Roman"/>
+          <w:sz w:val="24"/>
+          <w:szCs w:val="24"/>
+        </w:rPr>
+      </w:pPr>
     </w:p>
     <w:p>
       <w:pPr>
-        <w:spacing w:after="0" w:line="240" w:lineRule="auto"/>
-        <w:rPr>
-          <w:rFonts w:ascii="Times New Roman" w:hAnsi="Times New Roman" w:cs="Times New Roman"/>
-          <w:sz w:val="21"/>
-          <w:szCs w:val="21"/>
+        <w:spacing w:after="0" w:line="360" w:lineRule="auto"/>
+        <w:jc w:val="both"/>
+        <w:rPr>
+          <w:rFonts w:ascii="Times New Roman" w:hAnsi="Times New Roman" w:cs="Times New Roman"/>
+          <w:b/>
+          <w:sz w:val="36"/>
+          <w:szCs w:val="36"/>
         </w:rPr>
       </w:pPr>
       <w:r>
         <w:rPr>
           <w:rFonts w:ascii="Times New Roman" w:hAnsi="Times New Roman" w:cs="Times New Roman"/>
           <w:b/>
-          <w:sz w:val="21"/>
-          <w:szCs w:val="21"/>
+          <w:sz w:val="36"/>
+          <w:szCs w:val="36"/>
         </w:rPr>
         <w:t>PORTFOLIO</w:t>
       </w:r>
@@ -1516,18 +1571,19 @@
           <w:ilvl w:val="0"/>
           <w:numId w:val="10"/>
         </w:numPr>
-        <w:spacing w:after="0" w:line="240" w:lineRule="auto"/>
-        <w:rPr>
-          <w:rFonts w:ascii="Times New Roman" w:hAnsi="Times New Roman" w:cs="Times New Roman"/>
-          <w:sz w:val="21"/>
-          <w:szCs w:val="21"/>
+        <w:spacing w:after="0" w:line="360" w:lineRule="auto"/>
+        <w:jc w:val="both"/>
+        <w:rPr>
+          <w:rFonts w:ascii="Times New Roman" w:hAnsi="Times New Roman" w:cs="Times New Roman"/>
+          <w:sz w:val="24"/>
+          <w:szCs w:val="24"/>
         </w:rPr>
       </w:pPr>
       <w:r>
         <w:rPr>
           <w:rFonts w:ascii="Times New Roman" w:hAnsi="Times New Roman" w:cs="Times New Roman"/>
-          <w:sz w:val="21"/>
-          <w:szCs w:val="21"/>
+          <w:sz w:val="24"/>
+          <w:szCs w:val="24"/>
         </w:rPr>
         <w:t>GitHub and portfolio: github.com/mugarrajohnson and johnsonmugarra.com, with repositories, project write-ups, live D3.js analytics, and publications with DOIs.</w:t>
       </w:r>
@@ -1539,18 +1595,19 @@
           <w:ilvl w:val="0"/>
           <w:numId w:val="10"/>
         </w:numPr>
-        <w:spacing w:after="0" w:line="240" w:lineRule="auto"/>
-        <w:rPr>
-          <w:rFonts w:ascii="Times New Roman" w:hAnsi="Times New Roman" w:cs="Times New Roman"/>
-          <w:sz w:val="21"/>
-          <w:szCs w:val="21"/>
+        <w:spacing w:after="0" w:line="360" w:lineRule="auto"/>
+        <w:jc w:val="both"/>
+        <w:rPr>
+          <w:rFonts w:ascii="Times New Roman" w:hAnsi="Times New Roman" w:cs="Times New Roman"/>
+          <w:sz w:val="24"/>
+          <w:szCs w:val="24"/>
         </w:rPr>
       </w:pPr>
       <w:r>
         <w:rPr>
           <w:rFonts w:ascii="Times New Roman" w:hAnsi="Times New Roman" w:cs="Times New Roman"/>
-          <w:sz w:val="21"/>
-          <w:szCs w:val="21"/>
+          <w:sz w:val="24"/>
+          <w:szCs w:val="24"/>
         </w:rPr>
         <w:t>Vanilla forecasting: Prophet and ARIMA models combining NASA POWER climate data with field measurements; interactive harvest model on the website, presented nationally at Makerere.</w:t>
       </w:r>
@@ -1562,18 +1619,19 @@
           <w:ilvl w:val="0"/>
           <w:numId w:val="10"/>
         </w:numPr>
-        <w:spacing w:after="0" w:line="240" w:lineRule="auto"/>
-        <w:rPr>
-          <w:rFonts w:ascii="Times New Roman" w:hAnsi="Times New Roman" w:cs="Times New Roman"/>
-          <w:sz w:val="21"/>
-          <w:szCs w:val="21"/>
+        <w:spacing w:after="0" w:line="360" w:lineRule="auto"/>
+        <w:jc w:val="both"/>
+        <w:rPr>
+          <w:rFonts w:ascii="Times New Roman" w:hAnsi="Times New Roman" w:cs="Times New Roman"/>
+          <w:sz w:val="24"/>
+          <w:szCs w:val="24"/>
         </w:rPr>
       </w:pPr>
       <w:r>
         <w:rPr>
           <w:rFonts w:ascii="Times New Roman" w:hAnsi="Times New Roman" w:cs="Times New Roman"/>
-          <w:sz w:val="21"/>
-          <w:szCs w:val="21"/>
+          <w:sz w:val="24"/>
+          <w:szCs w:val="24"/>
         </w:rPr>
         <w:t>Farm data platform (Enimiro): seven scheduled Python and R pipelines moving SurveyCTO submissions into PostgreSQL, feeding Power BI and Looker dashboards; available as a private walk-through on request.</w:t>
       </w:r>
@@ -1585,167 +1643,183 @@
           <w:ilvl w:val="0"/>
           <w:numId w:val="10"/>
         </w:numPr>
-        <w:spacing w:after="0" w:line="240" w:lineRule="auto"/>
-        <w:rPr>
-          <w:rFonts w:ascii="Times New Roman" w:hAnsi="Times New Roman" w:cs="Times New Roman"/>
-          <w:sz w:val="21"/>
-          <w:szCs w:val="21"/>
+        <w:spacing w:after="0" w:line="360" w:lineRule="auto"/>
+        <w:jc w:val="both"/>
+        <w:rPr>
+          <w:rFonts w:ascii="Times New Roman" w:hAnsi="Times New Roman" w:cs="Times New Roman"/>
+          <w:sz w:val="24"/>
+          <w:szCs w:val="24"/>
         </w:rPr>
       </w:pPr>
       <w:r>
         <w:rPr>
           <w:rFonts w:ascii="Times New Roman" w:hAnsi="Times New Roman" w:cs="Times New Roman"/>
-          <w:sz w:val="21"/>
-          <w:szCs w:val="21"/>
+          <w:sz w:val="24"/>
+          <w:szCs w:val="24"/>
         </w:rPr>
         <w:t>Automated evaluation pipeline: Python ingestion, cleaning, and report generation that makes the recurring evaluation cycle repeatable.</w:t>
       </w:r>
     </w:p>
     <w:p>
       <w:pPr>
-        <w:spacing w:after="0" w:line="240" w:lineRule="auto"/>
-        <w:rPr>
-          <w:rFonts w:ascii="Times New Roman" w:hAnsi="Times New Roman" w:cs="Times New Roman"/>
-          <w:sz w:val="21"/>
-          <w:szCs w:val="21"/>
+        <w:spacing w:after="0" w:line="360" w:lineRule="auto"/>
+        <w:jc w:val="both"/>
+        <w:rPr>
+          <w:rFonts w:ascii="Times New Roman" w:hAnsi="Times New Roman" w:cs="Times New Roman"/>
+          <w:sz w:val="24"/>
+          <w:szCs w:val="24"/>
+        </w:rPr>
+      </w:pPr>
+    </w:p>
+    <w:p>
+      <w:pPr>
+        <w:spacing w:after="0" w:line="360" w:lineRule="auto"/>
+        <w:jc w:val="both"/>
+        <w:rPr>
+          <w:rFonts w:ascii="Times New Roman" w:hAnsi="Times New Roman" w:cs="Times New Roman"/>
+          <w:b/>
+          <w:sz w:val="36"/>
+          <w:szCs w:val="36"/>
         </w:rPr>
       </w:pPr>
       <w:r>
         <w:rPr>
           <w:rFonts w:ascii="Times New Roman" w:hAnsi="Times New Roman" w:cs="Times New Roman"/>
           <w:b/>
-          <w:sz w:val="21"/>
-          <w:szCs w:val="21"/>
+          <w:sz w:val="36"/>
+          <w:szCs w:val="36"/>
         </w:rPr>
         <w:t>EDUCATION</w:t>
       </w:r>
     </w:p>
     <w:p>
       <w:pPr>
-        <w:spacing w:after="0" w:line="240" w:lineRule="auto"/>
-        <w:rPr>
-          <w:rFonts w:ascii="Times New Roman" w:hAnsi="Times New Roman" w:cs="Times New Roman"/>
-          <w:sz w:val="21"/>
-          <w:szCs w:val="21"/>
+        <w:spacing w:after="0" w:line="360" w:lineRule="auto"/>
+        <w:jc w:val="both"/>
+        <w:rPr>
+          <w:rFonts w:ascii="Times New Roman" w:hAnsi="Times New Roman" w:cs="Times New Roman"/>
+          <w:b/>
+          <w:sz w:val="32"/>
+          <w:szCs w:val="32"/>
         </w:rPr>
       </w:pPr>
       <w:r>
         <w:rPr>
           <w:rFonts w:ascii="Times New Roman" w:hAnsi="Times New Roman" w:cs="Times New Roman"/>
           <w:b/>
-          <w:sz w:val="21"/>
-          <w:szCs w:val="21"/>
+          <w:sz w:val="32"/>
+          <w:szCs w:val="32"/>
         </w:rPr>
         <w:t>M.Sc. Data Science, September 2022 - October 2024</w:t>
       </w:r>
     </w:p>
     <w:p>
       <w:pPr>
-        <w:spacing w:after="0" w:line="240" w:lineRule="auto"/>
-        <w:rPr>
-          <w:rFonts w:ascii="Times New Roman" w:hAnsi="Times New Roman" w:cs="Times New Roman"/>
-          <w:sz w:val="21"/>
-          <w:szCs w:val="21"/>
+        <w:spacing w:after="0" w:line="360" w:lineRule="auto"/>
+        <w:jc w:val="both"/>
+        <w:rPr>
+          <w:rFonts w:ascii="Times New Roman" w:hAnsi="Times New Roman" w:cs="Times New Roman"/>
+          <w:sz w:val="28"/>
+          <w:szCs w:val="28"/>
         </w:rPr>
       </w:pPr>
       <w:r>
         <w:rPr>
           <w:rFonts w:ascii="Times New Roman" w:hAnsi="Times New Roman" w:cs="Times New Roman"/>
-          <w:i/>
-          <w:sz w:val="21"/>
-          <w:szCs w:val="21"/>
+          <w:sz w:val="28"/>
+          <w:szCs w:val="28"/>
         </w:rPr>
         <w:t>Manipal Academy of Higher Education (MAHE), Karnataka, India</w:t>
       </w:r>
     </w:p>
     <w:p>
       <w:pPr>
-        <w:spacing w:after="0" w:line="240" w:lineRule="auto"/>
-        <w:rPr>
-          <w:rFonts w:ascii="Times New Roman" w:hAnsi="Times New Roman" w:cs="Times New Roman"/>
-          <w:sz w:val="21"/>
-          <w:szCs w:val="21"/>
+        <w:spacing w:after="0" w:line="360" w:lineRule="auto"/>
+        <w:jc w:val="both"/>
+        <w:rPr>
+          <w:rFonts w:ascii="Times New Roman" w:hAnsi="Times New Roman" w:cs="Times New Roman"/>
+          <w:sz w:val="24"/>
+          <w:szCs w:val="24"/>
         </w:rPr>
       </w:pPr>
       <w:r>
         <w:rPr>
           <w:rFonts w:ascii="Times New Roman" w:hAnsi="Times New Roman" w:cs="Times New Roman"/>
           <w:i/>
-          <w:sz w:val="21"/>
-          <w:szCs w:val="21"/>
+          <w:sz w:val="24"/>
+          <w:szCs w:val="24"/>
         </w:rPr>
         <w:t>Coursework: Machine Learning, Deep Learning, Predictive Analytics, Time-Series Forecasting</w:t>
       </w:r>
     </w:p>
     <w:p>
       <w:pPr>
-        <w:spacing w:after="0" w:line="240" w:lineRule="auto"/>
-        <w:rPr>
-          <w:rFonts w:ascii="Times New Roman" w:hAnsi="Times New Roman" w:cs="Times New Roman"/>
-          <w:sz w:val="21"/>
-          <w:szCs w:val="21"/>
+        <w:spacing w:after="0" w:line="360" w:lineRule="auto"/>
+        <w:jc w:val="both"/>
+        <w:rPr>
+          <w:rFonts w:ascii="Times New Roman" w:hAnsi="Times New Roman" w:cs="Times New Roman"/>
+          <w:b/>
+          <w:sz w:val="32"/>
+          <w:szCs w:val="32"/>
         </w:rPr>
       </w:pPr>
       <w:r>
         <w:rPr>
           <w:rFonts w:ascii="Times New Roman" w:hAnsi="Times New Roman" w:cs="Times New Roman"/>
           <w:b/>
-          <w:sz w:val="21"/>
-          <w:szCs w:val="21"/>
+          <w:sz w:val="32"/>
+          <w:szCs w:val="32"/>
         </w:rPr>
         <w:t>B.Sc. Agriculture Science, August 2016 - May 2021</w:t>
       </w:r>
     </w:p>
     <w:p>
       <w:pPr>
-        <w:spacing w:after="0" w:line="240" w:lineRule="auto"/>
-        <w:rPr>
-          <w:rFonts w:ascii="Times New Roman" w:hAnsi="Times New Roman" w:cs="Times New Roman"/>
-          <w:sz w:val="21"/>
-          <w:szCs w:val="21"/>
+        <w:spacing w:after="0" w:line="360" w:lineRule="auto"/>
+        <w:jc w:val="both"/>
+        <w:rPr>
+          <w:rFonts w:ascii="Times New Roman" w:hAnsi="Times New Roman" w:cs="Times New Roman"/>
+          <w:sz w:val="28"/>
+          <w:szCs w:val="28"/>
         </w:rPr>
       </w:pPr>
       <w:r>
         <w:rPr>
           <w:rFonts w:ascii="Times New Roman" w:hAnsi="Times New Roman" w:cs="Times New Roman"/>
-          <w:i/>
-          <w:sz w:val="21"/>
-          <w:szCs w:val="21"/>
+          <w:sz w:val="28"/>
+          <w:szCs w:val="28"/>
         </w:rPr>
         <w:t>Makerere University, Kampala, Uganda</w:t>
       </w:r>
     </w:p>
     <w:p>
       <w:pPr>
-        <w:spacing w:after="0" w:line="240" w:lineRule="auto"/>
-        <w:rPr>
-          <w:rFonts w:ascii="Times New Roman" w:hAnsi="Times New Roman" w:cs="Times New Roman"/>
-          <w:b/>
-          <w:sz w:val="2"/>
-          <w:szCs w:val="2"/>
-        </w:rPr>
-      </w:pPr>
-      <w:r>
-        <w:rPr>
-          <w:sz w:val="8"/>
-        </w:rPr>
-      </w:r>
+        <w:spacing w:after="0" w:line="360" w:lineRule="auto"/>
+        <w:jc w:val="both"/>
+        <w:rPr>
+          <w:rFonts w:ascii="Times New Roman" w:hAnsi="Times New Roman" w:cs="Times New Roman"/>
+          <w:sz w:val="28"/>
+          <w:szCs w:val="28"/>
+        </w:rPr>
+      </w:pPr>
     </w:p>
     <w:p>
       <w:pPr>
-        <w:spacing w:after="0" w:line="240" w:lineRule="auto"/>
-        <w:rPr>
-          <w:rFonts w:ascii="Times New Roman" w:hAnsi="Times New Roman" w:cs="Times New Roman"/>
-          <w:sz w:val="21"/>
-          <w:szCs w:val="21"/>
+        <w:spacing w:after="0" w:line="360" w:lineRule="auto"/>
+        <w:jc w:val="both"/>
+        <w:rPr>
+          <w:rFonts w:ascii="Times New Roman" w:hAnsi="Times New Roman" w:cs="Times New Roman"/>
+          <w:b/>
+          <w:sz w:val="36"/>
+          <w:szCs w:val="36"/>
         </w:rPr>
       </w:pPr>
       <w:r>
         <w:rPr>
           <w:rFonts w:ascii="Times New Roman" w:hAnsi="Times New Roman" w:cs="Times New Roman"/>
           <w:b/>
-          <w:sz w:val="21"/>
-          <w:szCs w:val="21"/>
+          <w:sz w:val="36"/>
+          <w:szCs w:val="36"/>
         </w:rPr>
         <w:t>CERTIFICATIONS</w:t>
       </w:r>
@@ -1753,18 +1827,23 @@
     <w:p>
       <w:pPr>
         <w:pStyle w:val="ListParagraph"/>
-        <w:spacing w:after="0" w:line="240" w:lineRule="auto"/>
-        <w:rPr>
-          <w:rFonts w:ascii="Times New Roman" w:hAnsi="Times New Roman" w:cs="Times New Roman"/>
-          <w:sz w:val="21"/>
-          <w:szCs w:val="21"/>
+        <w:numPr>
+          <w:ilvl w:val="0"/>
+          <w:numId w:val="14"/>
+        </w:numPr>
+        <w:spacing w:after="0" w:line="360" w:lineRule="auto"/>
+        <w:jc w:val="both"/>
+        <w:rPr>
+          <w:rFonts w:ascii="Times New Roman" w:hAnsi="Times New Roman" w:cs="Times New Roman"/>
+          <w:sz w:val="24"/>
+          <w:szCs w:val="24"/>
         </w:rPr>
       </w:pPr>
       <w:r>
         <w:rPr>
           <w:rFonts w:ascii="Times New Roman" w:hAnsi="Times New Roman" w:cs="Times New Roman"/>
-          <w:sz w:val="21"/>
-          <w:szCs w:val="21"/>
+          <w:sz w:val="24"/>
+          <w:szCs w:val="24"/>
         </w:rPr>
         <w:t>SAS Certified Statistical Business Analyst</w:t>
       </w:r>
@@ -1772,18 +1851,23 @@
     <w:p>
       <w:pPr>
         <w:pStyle w:val="ListParagraph"/>
-        <w:spacing w:after="0" w:line="240" w:lineRule="auto"/>
-        <w:rPr>
-          <w:rFonts w:ascii="Times New Roman" w:hAnsi="Times New Roman" w:cs="Times New Roman"/>
-          <w:sz w:val="21"/>
-          <w:szCs w:val="21"/>
+        <w:numPr>
+          <w:ilvl w:val="0"/>
+          <w:numId w:val="14"/>
+        </w:numPr>
+        <w:spacing w:after="0" w:line="360" w:lineRule="auto"/>
+        <w:jc w:val="both"/>
+        <w:rPr>
+          <w:rFonts w:ascii="Times New Roman" w:hAnsi="Times New Roman" w:cs="Times New Roman"/>
+          <w:sz w:val="24"/>
+          <w:szCs w:val="24"/>
         </w:rPr>
       </w:pPr>
       <w:r>
         <w:rPr>
           <w:rFonts w:ascii="Times New Roman" w:hAnsi="Times New Roman" w:cs="Times New Roman"/>
-          <w:sz w:val="21"/>
-          <w:szCs w:val="21"/>
+          <w:sz w:val="24"/>
+          <w:szCs w:val="24"/>
         </w:rPr>
         <w:t>Microsoft Certified: Power BI Data Analyst Associate</w:t>
       </w:r>
@@ -1791,18 +1875,23 @@
     <w:p>
       <w:pPr>
         <w:pStyle w:val="ListParagraph"/>
-        <w:spacing w:after="0" w:line="240" w:lineRule="auto"/>
-        <w:rPr>
-          <w:rFonts w:ascii="Times New Roman" w:hAnsi="Times New Roman" w:cs="Times New Roman"/>
-          <w:sz w:val="21"/>
-          <w:szCs w:val="21"/>
+        <w:numPr>
+          <w:ilvl w:val="0"/>
+          <w:numId w:val="14"/>
+        </w:numPr>
+        <w:spacing w:after="0" w:line="360" w:lineRule="auto"/>
+        <w:jc w:val="both"/>
+        <w:rPr>
+          <w:rFonts w:ascii="Times New Roman" w:hAnsi="Times New Roman" w:cs="Times New Roman"/>
+          <w:sz w:val="24"/>
+          <w:szCs w:val="24"/>
         </w:rPr>
       </w:pPr>
       <w:r>
         <w:rPr>
           <w:rFonts w:ascii="Times New Roman" w:hAnsi="Times New Roman" w:cs="Times New Roman"/>
-          <w:sz w:val="21"/>
-          <w:szCs w:val="21"/>
+          <w:sz w:val="24"/>
+          <w:szCs w:val="24"/>
         </w:rPr>
         <w:t>Tableau Desktop Specialist</w:t>
       </w:r>
@@ -1810,18 +1899,23 @@
     <w:p>
       <w:pPr>
         <w:pStyle w:val="ListParagraph"/>
-        <w:spacing w:after="0" w:line="240" w:lineRule="auto"/>
-        <w:rPr>
-          <w:rFonts w:ascii="Times New Roman" w:hAnsi="Times New Roman" w:cs="Times New Roman"/>
-          <w:sz w:val="21"/>
-          <w:szCs w:val="21"/>
+        <w:numPr>
+          <w:ilvl w:val="0"/>
+          <w:numId w:val="14"/>
+        </w:numPr>
+        <w:spacing w:after="0" w:line="360" w:lineRule="auto"/>
+        <w:jc w:val="both"/>
+        <w:rPr>
+          <w:rFonts w:ascii="Times New Roman" w:hAnsi="Times New Roman" w:cs="Times New Roman"/>
+          <w:sz w:val="24"/>
+          <w:szCs w:val="24"/>
         </w:rPr>
       </w:pPr>
       <w:r>
         <w:rPr>
           <w:rFonts w:ascii="Times New Roman" w:hAnsi="Times New Roman" w:cs="Times New Roman"/>
-          <w:sz w:val="21"/>
-          <w:szCs w:val="21"/>
+          <w:sz w:val="24"/>
+          <w:szCs w:val="24"/>
         </w:rPr>
         <w:t>Google Project Management Certificate</w:t>
       </w:r>
@@ -1829,54 +1923,55 @@
     <w:p>
       <w:pPr>
         <w:pStyle w:val="ListParagraph"/>
-        <w:spacing w:after="0" w:line="240" w:lineRule="auto"/>
-        <w:rPr>
-          <w:rFonts w:ascii="Times New Roman" w:hAnsi="Times New Roman" w:cs="Times New Roman"/>
-          <w:sz w:val="21"/>
-          <w:szCs w:val="21"/>
+        <w:numPr>
+          <w:ilvl w:val="0"/>
+          <w:numId w:val="14"/>
+        </w:numPr>
+        <w:spacing w:after="0" w:line="360" w:lineRule="auto"/>
+        <w:jc w:val="both"/>
+        <w:rPr>
+          <w:rFonts w:ascii="Times New Roman" w:hAnsi="Times New Roman" w:cs="Times New Roman"/>
+          <w:sz w:val="24"/>
+          <w:szCs w:val="24"/>
         </w:rPr>
       </w:pPr>
       <w:r>
         <w:rPr>
           <w:rFonts w:ascii="Times New Roman" w:hAnsi="Times New Roman" w:cs="Times New Roman"/>
-          <w:sz w:val="21"/>
-          <w:szCs w:val="21"/>
+          <w:sz w:val="24"/>
+          <w:szCs w:val="24"/>
         </w:rPr>
         <w:t>Human Subjects Research (CITI)</w:t>
       </w:r>
     </w:p>
     <w:p>
       <w:pPr>
-        <w:spacing w:after="0" w:line="240" w:lineRule="auto"/>
-        <w:rPr>
-          <w:rFonts w:ascii="Times New Roman" w:hAnsi="Times New Roman" w:cs="Times New Roman"/>
-          <w:b/>
-          <w:sz w:val="2"/>
-          <w:szCs w:val="2"/>
-        </w:rPr>
-      </w:pPr>
-      <w:r>
-        <w:rPr>
-          <w:sz w:val="8"/>
-        </w:rPr>
-      </w:r>
+        <w:spacing w:after="0" w:line="360" w:lineRule="auto"/>
+        <w:jc w:val="both"/>
+        <w:rPr>
+          <w:rFonts w:ascii="Times New Roman" w:hAnsi="Times New Roman" w:cs="Times New Roman"/>
+          <w:sz w:val="24"/>
+          <w:szCs w:val="24"/>
+        </w:rPr>
+      </w:pPr>
     </w:p>
     <w:p>
       <w:pPr>
-        <w:spacing w:after="0" w:line="240" w:lineRule="auto"/>
-        <w:rPr>
-          <w:rFonts w:ascii="Times New Roman" w:hAnsi="Times New Roman" w:cs="Times New Roman"/>
-          <w:sz w:val="21"/>
-          <w:szCs w:val="21"/>
-        </w:rPr>
-        <w:keepNext/>
+        <w:spacing w:after="0" w:line="360" w:lineRule="auto"/>
+        <w:jc w:val="both"/>
+        <w:rPr>
+          <w:rFonts w:ascii="Times New Roman" w:hAnsi="Times New Roman" w:cs="Times New Roman"/>
+          <w:b/>
+          <w:sz w:val="36"/>
+          <w:szCs w:val="36"/>
+        </w:rPr>
       </w:pPr>
       <w:r>
         <w:rPr>
           <w:rFonts w:ascii="Times New Roman" w:hAnsi="Times New Roman" w:cs="Times New Roman"/>
           <w:b/>
-          <w:sz w:val="21"/>
-          <w:szCs w:val="21"/>
+          <w:sz w:val="36"/>
+          <w:szCs w:val="36"/>
         </w:rPr>
         <w:t>REFERENCE</w:t>
       </w:r>
@@ -1888,18 +1983,19 @@
           <w:ilvl w:val="0"/>
           <w:numId w:val="13"/>
         </w:numPr>
-        <w:spacing w:after="0" w:line="240" w:lineRule="auto"/>
-        <w:rPr>
-          <w:rFonts w:ascii="Times New Roman" w:hAnsi="Times New Roman" w:cs="Times New Roman"/>
-          <w:sz w:val="21"/>
-          <w:szCs w:val="21"/>
+        <w:spacing w:after="0" w:line="360" w:lineRule="auto"/>
+        <w:jc w:val="both"/>
+        <w:rPr>
+          <w:rFonts w:ascii="Times New Roman" w:hAnsi="Times New Roman" w:cs="Times New Roman"/>
+          <w:sz w:val="24"/>
+          <w:szCs w:val="24"/>
         </w:rPr>
       </w:pPr>
       <w:r>
         <w:rPr>
           <w:rFonts w:ascii="Times New Roman" w:hAnsi="Times New Roman" w:cs="Times New Roman"/>
-          <w:sz w:val="21"/>
-          <w:szCs w:val="21"/>
+          <w:sz w:val="24"/>
+          <w:szCs w:val="24"/>
         </w:rPr>
         <w:t>Available on request.</w:t>
       </w:r>
@@ -2201,6 +2297,119 @@
     </w:lvl>
   </w:abstractNum>
   <w:abstractNum w:abstractNumId="10" w15:restartNumberingAfterBreak="0">
+    <w:nsid w:val="14DF5B11"/>
+    <w:multiLevelType w:val="hybridMultilevel"/>
+    <w:tmpl w:val="C8FA9D52"/>
+    <w:lvl w:ilvl="0" w:tplc="04090001">
+      <w:start w:val="1"/>
+      <w:numFmt w:val="bullet"/>
+      <w:lvlText w:val=""/>
+      <w:lvlJc w:val="left"/>
+      <w:pPr>
+        <w:ind w:left="360" w:hanging="360"/>
+      </w:pPr>
+      <w:rPr>
+        <w:rFonts w:ascii="Symbol" w:hAnsi="Symbol" w:hint="default"/>
+      </w:rPr>
+    </w:lvl>
+    <w:lvl w:ilvl="1" w:tplc="04090003" w:tentative="1">
+      <w:start w:val="1"/>
+      <w:numFmt w:val="bullet"/>
+      <w:lvlText w:val="o"/>
+      <w:lvlJc w:val="left"/>
+      <w:pPr>
+        <w:ind w:left="1080" w:hanging="360"/>
+      </w:pPr>
+      <w:rPr>
+        <w:rFonts w:ascii="Courier New" w:hAnsi="Courier New" w:hint="default"/>
+      </w:rPr>
+    </w:lvl>
+    <w:lvl w:ilvl="2" w:tplc="04090005" w:tentative="1">
+      <w:start w:val="1"/>
+      <w:numFmt w:val="bullet"/>
+      <w:lvlText w:val=""/>
+      <w:lvlJc w:val="left"/>
+      <w:pPr>
+        <w:ind w:left="1800" w:hanging="360"/>
+      </w:pPr>
+      <w:rPr>
+        <w:rFonts w:ascii="Wingdings" w:hAnsi="Wingdings" w:hint="default"/>
+      </w:rPr>
+    </w:lvl>
+    <w:lvl w:ilvl="3" w:tplc="04090001" w:tentative="1">
+      <w:start w:val="1"/>
+      <w:numFmt w:val="bullet"/>
+      <w:lvlText w:val=""/>
+      <w:lvlJc w:val="left"/>
+      <w:pPr>
+        <w:ind w:left="2520" w:hanging="360"/>
+      </w:pPr>
+      <w:rPr>
+        <w:rFonts w:ascii="Symbol" w:hAnsi="Symbol" w:hint="default"/>
+      </w:rPr>
+    </w:lvl>
+    <w:lvl w:ilvl="4" w:tplc="04090003" w:tentative="1">
+      <w:start w:val="1"/>
+      <w:numFmt w:val="bullet"/>
+      <w:lvlText w:val="o"/>
+      <w:lvlJc w:val="left"/>
+      <w:pPr>
+        <w:ind w:left="3240" w:hanging="360"/>
+      </w:pPr>
+      <w:rPr>
+        <w:rFonts w:ascii="Courier New" w:hAnsi="Courier New" w:hint="default"/>
+      </w:rPr>
+    </w:lvl>
+    <w:lvl w:ilvl="5" w:tplc="04090005" w:tentative="1">
+      <w:start w:val="1"/>
+      <w:numFmt w:val="bullet"/>
+      <w:lvlText w:val=""/>
+      <w:lvlJc w:val="left"/>
+      <w:pPr>
+        <w:ind w:left="3960" w:hanging="360"/>
+      </w:pPr>
+      <w:rPr>
+        <w:rFonts w:ascii="Wingdings" w:hAnsi="Wingdings" w:hint="default"/>
+      </w:rPr>
+    </w:lvl>
+    <w:lvl w:ilvl="6" w:tplc="04090001" w:tentative="1">
+      <w:start w:val="1"/>
+      <w:numFmt w:val="bullet"/>
+      <w:lvlText w:val=""/>
+      <w:lvlJc w:val="left"/>
+      <w:pPr>
+        <w:ind w:left="4680" w:hanging="360"/>
+      </w:pPr>
+      <w:rPr>
+        <w:rFonts w:ascii="Symbol" w:hAnsi="Symbol" w:hint="default"/>
+      </w:rPr>
+    </w:lvl>
+    <w:lvl w:ilvl="7" w:tplc="04090003" w:tentative="1">
+      <w:start w:val="1"/>
+      <w:numFmt w:val="bullet"/>
+      <w:lvlText w:val="o"/>
+      <w:lvlJc w:val="left"/>
+      <w:pPr>
+        <w:ind w:left="5400" w:hanging="360"/>
+      </w:pPr>
+      <w:rPr>
+        <w:rFonts w:ascii="Courier New" w:hAnsi="Courier New" w:hint="default"/>
+      </w:rPr>
+    </w:lvl>
+    <w:lvl w:ilvl="8" w:tplc="04090005" w:tentative="1">
+      <w:start w:val="1"/>
+      <w:numFmt w:val="bullet"/>
+      <w:lvlText w:val=""/>
+      <w:lvlJc w:val="left"/>
+      <w:pPr>
+        <w:ind w:left="6120" w:hanging="360"/>
+      </w:pPr>
+      <w:rPr>
+        <w:rFonts w:ascii="Wingdings" w:hAnsi="Wingdings" w:hint="default"/>
+      </w:rPr>
+    </w:lvl>
+  </w:abstractNum>
+  <w:abstractNum w:abstractNumId="11" w15:restartNumberingAfterBreak="0">
     <w:nsid w:val="171D5E4B"/>
     <w:multiLevelType w:val="hybridMultilevel"/>
     <w:tmpl w:val="F8A8F66A"/>
@@ -2313,7 +2522,7 @@
       </w:rPr>
     </w:lvl>
   </w:abstractNum>
-  <w:abstractNum w:abstractNumId="11" w15:restartNumberingAfterBreak="0">
+  <w:abstractNum w:abstractNumId="12" w15:restartNumberingAfterBreak="0">
     <w:nsid w:val="216C535D"/>
     <w:multiLevelType w:val="hybridMultilevel"/>
     <w:tmpl w:val="96EAF72E"/>
@@ -2426,7 +2635,7 @@
       </w:rPr>
     </w:lvl>
   </w:abstractNum>
-  <w:abstractNum w:abstractNumId="12" w15:restartNumberingAfterBreak="0">
+  <w:abstractNum w:abstractNumId="13" w15:restartNumberingAfterBreak="0">
     <w:nsid w:val="414D6CD6"/>
     <w:multiLevelType w:val="hybridMultilevel"/>
     <w:tmpl w:val="41BAF08A"/>
@@ -2567,15 +2776,18 @@
     <w:abstractNumId w:val="0"/>
   </w:num>
   <w:num w:numId="10" w16cid:durableId="2071224630">
-    <w:abstractNumId w:val="11"/>
+    <w:abstractNumId w:val="12"/>
   </w:num>
   <w:num w:numId="11" w16cid:durableId="589240996">
-    <w:abstractNumId w:val="12"/>
+    <w:abstractNumId w:val="13"/>
   </w:num>
   <w:num w:numId="12" w16cid:durableId="1598514963">
     <w:abstractNumId w:val="9"/>
   </w:num>
   <w:num w:numId="13" w16cid:durableId="1075518739">
+    <w:abstractNumId w:val="11"/>
+  </w:num>
+  <w:num w:numId="14" w16cid:durableId="509608065">
     <w:abstractNumId w:val="10"/>
   </w:num>
 </w:numbering>
@@ -13967,6 +14179,29 @@
       </w:tcPr>
     </w:tblStylePr>
   </w:style>
+  <w:style w:type="character" w:styleId="Hyperlink">
+    <w:name w:val="Hyperlink"/>
+    <w:basedOn w:val="DefaultParagraphFont"/>
+    <w:uiPriority w:val="99"/>
+    <w:unhideWhenUsed/>
+    <w:rsid w:val="00856E7C"/>
+    <w:rPr>
+      <w:color w:val="0000FF" w:themeColor="hyperlink"/>
+      <w:u w:val="single"/>
+    </w:rPr>
+  </w:style>
+  <w:style w:type="character" w:styleId="UnresolvedMention">
+    <w:name w:val="Unresolved Mention"/>
+    <w:basedOn w:val="DefaultParagraphFont"/>
+    <w:uiPriority w:val="99"/>
+    <w:semiHidden/>
+    <w:unhideWhenUsed/>
+    <w:rsid w:val="00856E7C"/>
+    <w:rPr>
+      <w:color w:val="605E5C"/>
+      <w:shd w:val="clear" w:color="auto" w:fill="E1DFDD"/>
+    </w:rPr>
+  </w:style>
 </w:styles>
 </file>
 

</xml_diff>

<commit_message>
New commit message on CV
</commit_message>
<xml_diff>
--- a/CV_Johnson_Mugarra_Standard.docx
+++ b/CV_Johnson_Mugarra_Standard.docx
@@ -52,55 +52,7 @@
         </w:rPr>
       </w:pPr>
       <w:r>
-        <w:rPr>
-          <w:rFonts w:ascii="Times New Roman" w:hAnsi="Times New Roman" w:cs="Times New Roman"/>
-          <w:sz w:val="24"/>
-          <w:szCs w:val="24"/>
-        </w:rPr>
-        <w:t xml:space="preserve">Kampala, Uganda, +256 702 860 815, </w:t>
-      </w:r>
-      <w:hyperlink r:id="rId6" w:history="1">
-        <w:r>
-          <w:rPr>
-            <w:rStyle w:val="Hyperlink"/>
-            <w:rFonts w:ascii="Times New Roman" w:hAnsi="Times New Roman" w:cs="Times New Roman"/>
-            <w:sz w:val="24"/>
-            <w:szCs w:val="24"/>
-          </w:rPr>
-          <w:t>johnsonmugarra@yahoo.com</w:t>
-        </w:r>
-      </w:hyperlink>
-      <w:r>
-        <w:rPr>
-          <w:rFonts w:ascii="Times New Roman" w:hAnsi="Times New Roman" w:cs="Times New Roman"/>
-          <w:sz w:val="24"/>
-          <w:szCs w:val="24"/>
-        </w:rPr>
-        <w:t xml:space="preserve">, </w:t>
-      </w:r>
-      <w:r>
-        <w:rPr>
-          <w:rFonts w:ascii="Times New Roman" w:hAnsi="Times New Roman" w:cs="Times New Roman"/>
-          <w:sz w:val="24"/>
-          <w:szCs w:val="24"/>
-        </w:rPr>
-        <w:t>johnsonmugarr</w:t>
-      </w:r>
-      <w:r>
-        <w:rPr>
-          <w:rFonts w:ascii="Times New Roman" w:hAnsi="Times New Roman" w:cs="Times New Roman"/>
-          <w:sz w:val="24"/>
-          <w:szCs w:val="24"/>
-        </w:rPr>
-        <w:t>a.com</w:t>
-      </w:r>
-      <w:r>
-        <w:rPr>
-          <w:rFonts w:ascii="Times New Roman" w:hAnsi="Times New Roman" w:cs="Times New Roman"/>
-          <w:sz w:val="24"/>
-          <w:szCs w:val="24"/>
-        </w:rPr>
-        <w:t xml:space="preserve"> </w:t>
+        <w:t>Kampala, Uganda, +256 702 860 815, johnsonmugarra@yahoo.com, johnsonmugarra.com, github.com/mugarrajohnson, linkedin.com/in/johnsonmugarra</w:t>
       </w:r>
     </w:p>
     <w:p>
@@ -233,6 +185,9 @@
         </w:rPr>
         <w:t>Research and evaluation: survey design, piloting and translation, computer-assisted interviewing, key informant interviews, focus group discussions, transcription</w:t>
       </w:r>
+      <w:r>
+        <w:t>, process and impact evaluation, monitoring and evaluation frameworks, indicator tracking</w:t>
+      </w:r>
     </w:p>
     <w:p>
       <w:pPr>
@@ -1530,6 +1485,134 @@
           <w:szCs w:val="24"/>
         </w:rPr>
         <w:t>Cleaned and analyzed survey data and prepared findings for client reports and proposals.</w:t>
+      </w:r>
+    </w:p>
+    <w:p>
+      <w:pPr>
+        <w:spacing w:after="0" w:line="360" w:lineRule="auto"/>
+        <w:jc w:val="both"/>
+        <w:rPr>
+          <w:rFonts w:ascii="Times New Roman" w:hAnsi="Times New Roman" w:cs="Times New Roman"/>
+          <w:b/>
+          <w:sz w:val="32"/>
+          <w:szCs w:val="32"/>
+        </w:rPr>
+      </w:pPr>
+      <w:r>
+        <w:rPr>
+          <w:rFonts w:ascii="Times New Roman" w:hAnsi="Times New Roman" w:cs="Times New Roman"/>
+          <w:b/>
+          <w:sz w:val="32"/>
+          <w:szCs w:val="32"/>
+        </w:rPr>
+        <w:t>Research Assistant, April 2021 - June 2021</w:t>
+      </w:r>
+    </w:p>
+    <w:p>
+      <w:pPr>
+        <w:spacing w:after="0" w:line="360" w:lineRule="auto"/>
+        <w:jc w:val="both"/>
+        <w:rPr>
+          <w:rFonts w:ascii="Times New Roman" w:hAnsi="Times New Roman" w:cs="Times New Roman"/>
+          <w:sz w:val="28"/>
+          <w:szCs w:val="28"/>
+        </w:rPr>
+      </w:pPr>
+      <w:r>
+        <w:rPr>
+          <w:rFonts w:ascii="Times New Roman" w:hAnsi="Times New Roman" w:cs="Times New Roman"/>
+          <w:sz w:val="28"/>
+          <w:szCs w:val="28"/>
+        </w:rPr>
+        <w:t>Makerere University Agricultural Research Institute, Wakiso, Uganda</w:t>
+      </w:r>
+    </w:p>
+    <w:p>
+      <w:pPr>
+        <w:pStyle w:val="ListParagraph"/>
+        <w:numPr>
+          <w:ilvl w:val="0"/>
+          <w:numId w:val="10"/>
+        </w:numPr>
+        <w:spacing w:after="0" w:line="360" w:lineRule="auto"/>
+        <w:jc w:val="both"/>
+        <w:rPr>
+          <w:rFonts w:ascii="Times New Roman" w:hAnsi="Times New Roman" w:cs="Times New Roman"/>
+          <w:sz w:val="24"/>
+          <w:szCs w:val="24"/>
+        </w:rPr>
+      </w:pPr>
+      <w:r>
+        <w:rPr>
+          <w:rFonts w:ascii="Times New Roman" w:hAnsi="Times New Roman" w:cs="Times New Roman"/>
+          <w:sz w:val="24"/>
+          <w:szCs w:val="24"/>
+        </w:rPr>
+        <w:t>Collected data from field trials and cleaned data in Excel for analysis.</w:t>
+      </w:r>
+    </w:p>
+    <w:p>
+      <w:pPr>
+        <w:spacing w:after="0" w:line="360" w:lineRule="auto"/>
+        <w:jc w:val="both"/>
+        <w:rPr>
+          <w:rFonts w:ascii="Times New Roman" w:hAnsi="Times New Roman" w:cs="Times New Roman"/>
+          <w:b/>
+          <w:sz w:val="32"/>
+          <w:szCs w:val="32"/>
+        </w:rPr>
+      </w:pPr>
+      <w:r>
+        <w:rPr>
+          <w:rFonts w:ascii="Times New Roman" w:hAnsi="Times New Roman" w:cs="Times New Roman"/>
+          <w:b/>
+          <w:sz w:val="32"/>
+          <w:szCs w:val="32"/>
+        </w:rPr>
+        <w:t>Data Entry Clerk, January 2021 - February 2021</w:t>
+      </w:r>
+    </w:p>
+    <w:p>
+      <w:pPr>
+        <w:spacing w:after="0" w:line="360" w:lineRule="auto"/>
+        <w:jc w:val="both"/>
+        <w:rPr>
+          <w:rFonts w:ascii="Times New Roman" w:hAnsi="Times New Roman" w:cs="Times New Roman"/>
+          <w:sz w:val="28"/>
+          <w:szCs w:val="28"/>
+        </w:rPr>
+      </w:pPr>
+      <w:r>
+        <w:rPr>
+          <w:rFonts w:ascii="Times New Roman" w:hAnsi="Times New Roman" w:cs="Times New Roman"/>
+          <w:sz w:val="28"/>
+          <w:szCs w:val="28"/>
+        </w:rPr>
+        <w:t>UNYFA, Kampala, Uganda</w:t>
+      </w:r>
+    </w:p>
+    <w:p>
+      <w:pPr>
+        <w:pStyle w:val="ListParagraph"/>
+        <w:numPr>
+          <w:ilvl w:val="0"/>
+          <w:numId w:val="10"/>
+        </w:numPr>
+        <w:spacing w:after="0" w:line="360" w:lineRule="auto"/>
+        <w:jc w:val="both"/>
+        <w:rPr>
+          <w:rFonts w:ascii="Times New Roman" w:hAnsi="Times New Roman" w:cs="Times New Roman"/>
+          <w:sz w:val="24"/>
+          <w:szCs w:val="24"/>
+        </w:rPr>
+      </w:pPr>
+      <w:r>
+        <w:rPr>
+          <w:rFonts w:ascii="Times New Roman" w:hAnsi="Times New Roman" w:cs="Times New Roman"/>
+          <w:sz w:val="24"/>
+          <w:szCs w:val="24"/>
+        </w:rPr>
+        <w:t>Entered and checked survey data for organizational databases, and ran quality audits to keep records complete before analysis.</w:t>
       </w:r>
     </w:p>
     <w:p>

</xml_diff>